<commit_message>
Finalize report workflow and polish mobile UI
</commit_message>
<xml_diff>
--- a/assets/report-templates/manager-reports/meeting-template-test.docx
+++ b/assets/report-templates/manager-reports/meeting-template-test.docx
@@ -1,14 +1,14 @@
 
 <file path=word/document.xml><?xml version="1.0" encoding="utf-8"?>
 <w:document xmlns:wpc="http://schemas.microsoft.com/office/word/2010/wordprocessingCanvas" xmlns:cx="http://schemas.microsoft.com/office/drawing/2014/chartex" xmlns:cx1="http://schemas.microsoft.com/office/drawing/2015/9/8/chartex" xmlns:cx2="http://schemas.microsoft.com/office/drawing/2015/10/21/chartex" xmlns:cx3="http://schemas.microsoft.com/office/drawing/2016/5/9/chartex" xmlns:cx4="http://schemas.microsoft.com/office/drawing/2016/5/10/chartex" xmlns:cx5="http://schemas.microsoft.com/office/drawing/2016/5/11/chartex" xmlns:cx6="http://schemas.microsoft.com/office/drawing/2016/5/12/chartex" xmlns:cx7="http://schemas.microsoft.com/office/drawing/2016/5/13/chartex" xmlns:cx8="http://schemas.microsoft.com/office/drawing/2016/5/14/chartex" xmlns:mc="http://schemas.openxmlformats.org/markup-compatibility/2006" xmlns:aink="http://schemas.microsoft.com/office/drawing/2016/ink" xmlns:am3d="http://schemas.microsoft.com/office/drawing/2017/model3d" xmlns:o="urn:schemas-microsoft-com:office:office" xmlns:oel="http://schemas.microsoft.com/office/2019/extlst" xmlns:r="http://schemas.openxmlformats.org/officeDocument/2006/relationships" xmlns:m="http://schemas.openxmlformats.org/officeDocument/2006/math" xmlns:v="urn:schemas-microsoft-com:vml" xmlns:wp14="http://schemas.microsoft.com/office/word/2010/wordprocessingDrawing" xmlns:wp="http://schemas.openxmlformats.org/drawingml/2006/wordprocessingDrawing" xmlns:w10="urn:schemas-microsoft-com:office:word" xmlns:w="http://schemas.openxmlformats.org/wordprocessingml/2006/main" xmlns:w14="http://schemas.microsoft.com/office/word/2010/wordml" xmlns:w15="http://schemas.microsoft.com/office/word/2012/wordml" xmlns:w16cex="http://schemas.microsoft.com/office/word/2018/wordml/cex" xmlns:w16cid="http://schemas.microsoft.com/office/word/2016/wordml/cid" xmlns:w16="http://schemas.microsoft.com/office/word/2018/wordml" xmlns:w16du="http://schemas.microsoft.com/office/word/2023/wordml/word16du" xmlns:w16sdtdh="http://schemas.microsoft.com/office/word/2020/wordml/sdtdatahash" xmlns:w16sdtfl="http://schemas.microsoft.com/office/word/2024/wordml/sdtformatlock" xmlns:w16se="http://schemas.microsoft.com/office/word/2015/wordml/symex" xmlns:wpg="http://schemas.microsoft.com/office/word/2010/wordprocessingGroup" xmlns:wpi="http://schemas.microsoft.com/office/word/2010/wordprocessingInk" xmlns:wne="http://schemas.microsoft.com/office/word/2006/wordml" xmlns:wps="http://schemas.microsoft.com/office/word/2010/wordprocessingShape" mc:Ignorable="w14 w15 w16se w16cid w16 w16cex w16sdtdh w16sdtfl w16du wp14">
-  <w:background w:color="E7E6E6"/>
+  <w:background w:color="F2F2F2"/>
   <w:body>
     <w:tbl>
       <w:tblPr>
         <w:tblStyle w:val="a6"/>
-        <w:tblpPr w:leftFromText="180" w:rightFromText="180" w:vertAnchor="text" w:horzAnchor="margin" w:tblpXSpec="right" w:tblpY="-1706"/>
+        <w:tblpPr w:leftFromText="180" w:rightFromText="180" w:vertAnchor="text" w:horzAnchor="page" w:tblpX="336" w:tblpY="-2291"/>
         <w:bidiVisual/>
-        <w:tblW w:w="7379" w:type="dxa"/>
+        <w:tblW w:w="5811" w:type="dxa"/>
         <w:tblBorders>
           <w:top w:val="none" w:sz="0" w:space="0" w:color="auto"/>
           <w:left w:val="none" w:sz="0" w:space="0" w:color="auto"/>
@@ -20,7 +20,7 @@
         <w:tblLook w:val="04A0" w:firstRow="1" w:lastRow="0" w:firstColumn="1" w:lastColumn="0" w:noHBand="0" w:noVBand="1"/>
       </w:tblPr>
       <w:tblGrid>
-        <w:gridCol w:w="7379"/>
+        <w:gridCol w:w="5811"/>
       </w:tblGrid>
       <w:tr>
         <w:trPr>
@@ -28,7 +28,7 @@
         </w:trPr>
         <w:tc>
           <w:tcPr>
-            <w:tcW w:w="7379" w:type="dxa"/>
+            <w:tcW w:w="5811" w:type="dxa"/>
             <w:vAlign w:val="center"/>
           </w:tcPr>
           <w:p>
@@ -52,7 +52,7 @@
                 <w:rtl/>
               </w:rPr>
               <w:drawing>
-                <wp:inline distT="0" distB="0" distL="0" distR="0" wp14:anchorId="14CD0B88" wp14:editId="2DABA2D4">
+                <wp:inline distT="0" distB="0" distL="0" distR="0" wp14:anchorId="0446179F" wp14:editId="1004E324">
                   <wp:extent cx="1936750" cy="1687211"/>
                   <wp:effectExtent l="0" t="0" r="6350" b="8255"/>
                   <wp:docPr id="2138136227" name="صورة 9"/>
@@ -98,11 +98,11 @@
       </w:tr>
       <w:tr>
         <w:trPr>
-          <w:trHeight w:val="2006"/>
+          <w:trHeight w:val="1133"/>
         </w:trPr>
         <w:tc>
           <w:tcPr>
-            <w:tcW w:w="7379" w:type="dxa"/>
+            <w:tcW w:w="5811" w:type="dxa"/>
           </w:tcPr>
           <w:p>
             <w:pPr>
@@ -128,7 +128,63 @@
                 <w:u w:val="single"/>
                 <w:rtl/>
               </w:rPr>
-              <w:t>{{educationDepartmentPrefix}} {{educationDepartmentName}}</w:t>
+              <w:t>{{</w:t>
+            </w:r>
+            <w:proofErr w:type="spellStart"/>
+            <w:r>
+              <w:rPr>
+                <w:rFonts w:ascii="Helvetica Neue W23 for SKY Bd" w:eastAsia="Times New Roman" w:hAnsi="Helvetica Neue W23 for SKY Bd" w:cs="Helvetica Neue W23 for SKY Bd"/>
+                <w:b/>
+                <w:bCs/>
+                <w:color w:val="04A9A6"/>
+                <w:sz w:val="28"/>
+                <w:szCs w:val="28"/>
+                <w:u w:val="single"/>
+                <w:rtl/>
+              </w:rPr>
+              <w:t>educationDepartmentPrefix</w:t>
+            </w:r>
+            <w:proofErr w:type="spellEnd"/>
+            <w:r>
+              <w:rPr>
+                <w:rFonts w:ascii="Helvetica Neue W23 for SKY Bd" w:eastAsia="Times New Roman" w:hAnsi="Helvetica Neue W23 for SKY Bd" w:cs="Helvetica Neue W23 for SKY Bd"/>
+                <w:b/>
+                <w:bCs/>
+                <w:color w:val="04A9A6"/>
+                <w:sz w:val="28"/>
+                <w:szCs w:val="28"/>
+                <w:u w:val="single"/>
+                <w:rtl/>
+              </w:rPr>
+              <w:t>}} {{</w:t>
+            </w:r>
+            <w:proofErr w:type="spellStart"/>
+            <w:r>
+              <w:rPr>
+                <w:rFonts w:ascii="Helvetica Neue W23 for SKY Bd" w:eastAsia="Times New Roman" w:hAnsi="Helvetica Neue W23 for SKY Bd" w:cs="Helvetica Neue W23 for SKY Bd"/>
+                <w:b/>
+                <w:bCs/>
+                <w:color w:val="04A9A6"/>
+                <w:sz w:val="28"/>
+                <w:szCs w:val="28"/>
+                <w:u w:val="single"/>
+                <w:rtl/>
+              </w:rPr>
+              <w:t>educationDepartmentName</w:t>
+            </w:r>
+            <w:proofErr w:type="spellEnd"/>
+            <w:r>
+              <w:rPr>
+                <w:rFonts w:ascii="Helvetica Neue W23 for SKY Bd" w:eastAsia="Times New Roman" w:hAnsi="Helvetica Neue W23 for SKY Bd" w:cs="Helvetica Neue W23 for SKY Bd"/>
+                <w:b/>
+                <w:bCs/>
+                <w:color w:val="04A9A6"/>
+                <w:sz w:val="28"/>
+                <w:szCs w:val="28"/>
+                <w:u w:val="single"/>
+                <w:rtl/>
+              </w:rPr>
+              <w:t>}}</w:t>
             </w:r>
           </w:p>
         </w:tc>
@@ -136,7 +192,7 @@
       <w:tr>
         <w:tc>
           <w:tcPr>
-            <w:tcW w:w="7379" w:type="dxa"/>
+            <w:tcW w:w="5811" w:type="dxa"/>
           </w:tcPr>
           <w:p>
             <w:pPr>
@@ -164,6 +220,7 @@
               </w:rPr>
               <w:t>{{</w:t>
             </w:r>
+            <w:proofErr w:type="spellStart"/>
             <w:r>
               <w:rPr>
                 <w:rFonts w:ascii="Helvetica Neue W23 for SKY Bd" w:eastAsia="Times New Roman" w:hAnsi="Helvetica Neue W23 for SKY Bd" w:cs="Helvetica Neue W23 for SKY Bd"/>
@@ -176,6 +233,7 @@
               </w:rPr>
               <w:t>schoolDisplayName</w:t>
             </w:r>
+            <w:proofErr w:type="spellEnd"/>
             <w:r>
               <w:rPr>
                 <w:rFonts w:ascii="Helvetica Neue W23 for SKY Bd" w:eastAsia="Times New Roman" w:hAnsi="Helvetica Neue W23 for SKY Bd" w:cs="Helvetica Neue W23 for SKY Bd"/>
@@ -208,13 +266,13 @@
         <mc:AlternateContent>
           <mc:Choice Requires="wps">
             <w:drawing>
-              <wp:anchor distT="0" distB="0" distL="114300" distR="114300" simplePos="0" relativeHeight="251660288" behindDoc="0" locked="0" layoutInCell="1" allowOverlap="1" wp14:anchorId="5FE87E68" wp14:editId="0D94A458">
+              <wp:anchor distT="0" distB="0" distL="114300" distR="114300" simplePos="0" relativeHeight="251668480" behindDoc="0" locked="0" layoutInCell="1" allowOverlap="1" wp14:anchorId="2603233F" wp14:editId="72B35348">
                 <wp:simplePos x="0" y="0"/>
                 <wp:positionH relativeFrom="page">
-                  <wp:posOffset>314325</wp:posOffset>
+                  <wp:posOffset>4215765</wp:posOffset>
                 </wp:positionH>
                 <wp:positionV relativeFrom="page">
-                  <wp:posOffset>85725</wp:posOffset>
+                  <wp:posOffset>400685</wp:posOffset>
                 </wp:positionV>
                 <wp:extent cx="3023870" cy="3255010"/>
                 <wp:effectExtent l="0" t="0" r="5080" b="2540"/>
@@ -263,7 +321,7 @@
                               <w:spacing w:after="0" w:line="240" w:lineRule="auto"/>
                               <w:jc w:val="center"/>
                               <w:rPr>
-                                <w:rFonts w:ascii="Helvetica Neue W23 for SKY Reg" w:hAnsi="Helvetica Neue W23 for SKY Reg" w:cs="Helvetica Neue W23 for SKY Reg"/>
+                                <w:rFonts w:ascii="Helvetica Neue W23 for SKY Bd" w:hAnsi="Helvetica Neue W23 for SKY Bd" w:cs="Helvetica Neue W23 for SKY Bd"/>
                                 <w:color w:val="FFFFFF" w:themeColor="background1"/>
                                 <w:sz w:val="56"/>
                                 <w:szCs w:val="56"/>
@@ -272,7 +330,7 @@
                             </w:pPr>
                             <w:r>
                               <w:rPr>
-                                <w:rFonts w:ascii="Helvetica Neue W23 for SKY Reg" w:hAnsi="Helvetica Neue W23 for SKY Reg" w:cs="Times New Roman"/>
+                                <w:rFonts w:ascii="Helvetica Neue W23 for SKY Bd" w:hAnsi="Helvetica Neue W23 for SKY Bd" w:cs="Helvetica Neue W23 for SKY Bd"/>
                                 <w:color w:val="FFFFFF" w:themeColor="background1"/>
                                 <w:sz w:val="56"/>
                                 <w:szCs w:val="56"/>
@@ -286,7 +344,7 @@
                               <w:spacing w:after="0" w:line="240" w:lineRule="auto"/>
                               <w:jc w:val="center"/>
                               <w:rPr>
-                                <w:rFonts w:ascii="Helvetica Neue W23 for SKY Reg" w:hAnsi="Helvetica Neue W23 for SKY Reg" w:cs="Helvetica Neue W23 for SKY Reg"/>
+                                <w:rFonts w:ascii="Helvetica Neue W23 for SKY Bd" w:hAnsi="Helvetica Neue W23 for SKY Bd" w:cs="Helvetica Neue W23 for SKY Bd"/>
                                 <w:b/>
                                 <w:bCs/>
                                 <w:color w:val="FFFFFF" w:themeColor="background1"/>
@@ -297,7 +355,7 @@
                             </w:pPr>
                             <w:r>
                               <w:rPr>
-                                <w:rFonts w:ascii="Helvetica Neue W23 for SKY Reg" w:hAnsi="Helvetica Neue W23 for SKY Reg" w:cs="Times New Roman" w:hint="cs"/>
+                                <w:rFonts w:ascii="Helvetica Neue W23 for SKY Bd" w:hAnsi="Helvetica Neue W23 for SKY Bd" w:cs="Helvetica Neue W23 for SKY Bd"/>
                                 <w:b/>
                                 <w:bCs/>
                                 <w:color w:val="FFFFFF" w:themeColor="background1"/>
@@ -313,7 +371,7 @@
                               <w:spacing w:after="0" w:line="240" w:lineRule="auto"/>
                               <w:jc w:val="center"/>
                               <w:rPr>
-                                <w:rFonts w:ascii="Helvetica Neue W23 for SKY Reg" w:hAnsi="Helvetica Neue W23 for SKY Reg" w:cs="Helvetica Neue W23 for SKY Reg"/>
+                                <w:rFonts w:ascii="Helvetica Neue W23 for SKY Bd" w:hAnsi="Helvetica Neue W23 for SKY Bd" w:cs="Helvetica Neue W23 for SKY Bd"/>
                                 <w:b/>
                                 <w:bCs/>
                                 <w:color w:val="FFFFFF" w:themeColor="background1"/>
@@ -328,7 +386,7 @@
                               <w:spacing w:after="0" w:line="240" w:lineRule="auto"/>
                               <w:jc w:val="center"/>
                               <w:rPr>
-                                <w:rFonts w:ascii="Helvetica Neue W23 for SKY Reg" w:hAnsi="Helvetica Neue W23 for SKY Reg" w:cs="Helvetica Neue W23 for SKY Reg"/>
+                                <w:rFonts w:ascii="Helvetica Neue W23 for SKY Bd" w:hAnsi="Helvetica Neue W23 for SKY Bd" w:cs="Helvetica Neue W23 for SKY Bd"/>
                                 <w:b/>
                                 <w:bCs/>
                                 <w:color w:val="FFFFFF" w:themeColor="background1"/>
@@ -339,7 +397,7 @@
                             </w:pPr>
                             <w:r>
                               <w:rPr>
-                                <w:rFonts w:ascii="Helvetica Neue W23 for SKY Reg" w:hAnsi="Helvetica Neue W23 for SKY Reg" w:cs="Times New Roman" w:hint="cs"/>
+                                <w:rFonts w:ascii="Helvetica Neue W23 for SKY Bd" w:hAnsi="Helvetica Neue W23 for SKY Bd" w:cs="Helvetica Neue W23 for SKY Bd"/>
                                 <w:b/>
                                 <w:bCs/>
                                 <w:color w:val="FFFFFF" w:themeColor="background1"/>
@@ -347,11 +405,11 @@
                                 <w:szCs w:val="44"/>
                                 <w:rtl/>
                               </w:rPr>
-                              <w:t xml:space="preserve">للعام الدراسي </w:t>
+                              <w:t>للعام الدراسي 144</w:t>
                             </w:r>
                             <w:r>
                               <w:rPr>
-                                <w:rFonts w:ascii="Helvetica Neue W23 for SKY Reg" w:hAnsi="Helvetica Neue W23 for SKY Reg" w:cs="Helvetica Neue W23 for SKY Reg" w:hint="cs"/>
+                                <w:rFonts w:ascii="Helvetica Neue W23 for SKY Bd" w:hAnsi="Helvetica Neue W23 for SKY Bd" w:cs="Helvetica Neue W23 for SKY Bd" w:hint="cs"/>
                                 <w:b/>
                                 <w:bCs/>
                                 <w:color w:val="FFFFFF" w:themeColor="background1"/>
@@ -359,11 +417,11 @@
                                 <w:szCs w:val="44"/>
                                 <w:rtl/>
                               </w:rPr>
-                              <w:t>1447</w:t>
+                              <w:t>8</w:t>
                             </w:r>
                             <w:r>
                               <w:rPr>
-                                <w:rFonts w:ascii="Helvetica Neue W23 for SKY Reg" w:hAnsi="Helvetica Neue W23 for SKY Reg" w:cs="Times New Roman" w:hint="cs"/>
+                                <w:rFonts w:ascii="Helvetica Neue W23 for SKY Bd" w:hAnsi="Helvetica Neue W23 for SKY Bd" w:cs="Helvetica Neue W23 for SKY Bd"/>
                                 <w:b/>
                                 <w:bCs/>
                                 <w:color w:val="FFFFFF" w:themeColor="background1"/>
@@ -396,7 +454,7 @@
           </mc:Choice>
           <mc:Fallback>
             <w:pict>
-              <v:rect w14:anchorId="5FE87E68" id="مستطيل 259" o:spid="_x0000_s1026" style="position:absolute;left:0;text-align:left;margin-left:24.75pt;margin-top:6.75pt;width:238.1pt;height:256.3pt;flip:x;z-index:251660288;visibility:visible;mso-wrap-style:square;mso-width-percent:0;mso-height-percent:0;mso-wrap-distance-left:9pt;mso-wrap-distance-top:0;mso-wrap-distance-right:9pt;mso-wrap-distance-bottom:0;mso-position-horizontal:absolute;mso-position-horizontal-relative:page;mso-position-vertical:absolute;mso-position-vertical-relative:page;mso-width-percent:0;mso-height-percent:0;mso-width-relative:page;mso-height-relative:page;v-text-anchor:bottom" o:gfxdata="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" fillcolor="#0da9a6" stroked="f" strokeweight="1pt">
+              <v:rect w14:anchorId="2603233F" id="مستطيل 259" o:spid="_x0000_s1026" style="position:absolute;left:0;text-align:left;margin-left:331.95pt;margin-top:31.55pt;width:238.1pt;height:256.3pt;flip:x;z-index:251668480;visibility:visible;mso-wrap-style:square;mso-width-percent:0;mso-height-percent:0;mso-wrap-distance-left:9pt;mso-wrap-distance-top:0;mso-wrap-distance-right:9pt;mso-wrap-distance-bottom:0;mso-position-horizontal:absolute;mso-position-horizontal-relative:page;mso-position-vertical:absolute;mso-position-vertical-relative:page;mso-width-percent:0;mso-height-percent:0;mso-width-relative:page;mso-height-relative:page;v-text-anchor:bottom" o:gfxdata="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" fillcolor="#0da9a6" stroked="f" strokeweight="1pt">
                 <v:textbox inset="14.4pt,14.4pt,14.4pt,28.8pt">
                   <w:txbxContent>
                     <w:p>
@@ -404,7 +462,7 @@
                         <w:spacing w:after="0" w:line="240" w:lineRule="auto"/>
                         <w:jc w:val="center"/>
                         <w:rPr>
-                          <w:rFonts w:ascii="Helvetica Neue W23 for SKY Reg" w:hAnsi="Helvetica Neue W23 for SKY Reg" w:cs="Helvetica Neue W23 for SKY Reg"/>
+                          <w:rFonts w:ascii="Helvetica Neue W23 for SKY Bd" w:hAnsi="Helvetica Neue W23 for SKY Bd" w:cs="Helvetica Neue W23 for SKY Bd"/>
                           <w:color w:val="FFFFFF" w:themeColor="background1"/>
                           <w:sz w:val="56"/>
                           <w:szCs w:val="56"/>
@@ -413,7 +471,7 @@
                       </w:pPr>
                       <w:r>
                         <w:rPr>
-                          <w:rFonts w:ascii="Helvetica Neue W23 for SKY Reg" w:hAnsi="Helvetica Neue W23 for SKY Reg" w:cs="Times New Roman"/>
+                          <w:rFonts w:ascii="Helvetica Neue W23 for SKY Bd" w:hAnsi="Helvetica Neue W23 for SKY Bd" w:cs="Helvetica Neue W23 for SKY Bd"/>
                           <w:color w:val="FFFFFF" w:themeColor="background1"/>
                           <w:sz w:val="56"/>
                           <w:szCs w:val="56"/>
@@ -427,7 +485,7 @@
                         <w:spacing w:after="0" w:line="240" w:lineRule="auto"/>
                         <w:jc w:val="center"/>
                         <w:rPr>
-                          <w:rFonts w:ascii="Helvetica Neue W23 for SKY Reg" w:hAnsi="Helvetica Neue W23 for SKY Reg" w:cs="Helvetica Neue W23 for SKY Reg"/>
+                          <w:rFonts w:ascii="Helvetica Neue W23 for SKY Bd" w:hAnsi="Helvetica Neue W23 for SKY Bd" w:cs="Helvetica Neue W23 for SKY Bd"/>
                           <w:b/>
                           <w:bCs/>
                           <w:color w:val="FFFFFF" w:themeColor="background1"/>
@@ -438,7 +496,7 @@
                       </w:pPr>
                       <w:r>
                         <w:rPr>
-                          <w:rFonts w:ascii="Helvetica Neue W23 for SKY Reg" w:hAnsi="Helvetica Neue W23 for SKY Reg" w:cs="Times New Roman" w:hint="cs"/>
+                          <w:rFonts w:ascii="Helvetica Neue W23 for SKY Bd" w:hAnsi="Helvetica Neue W23 for SKY Bd" w:cs="Helvetica Neue W23 for SKY Bd"/>
                           <w:b/>
                           <w:bCs/>
                           <w:color w:val="FFFFFF" w:themeColor="background1"/>
@@ -454,7 +512,7 @@
                         <w:spacing w:after="0" w:line="240" w:lineRule="auto"/>
                         <w:jc w:val="center"/>
                         <w:rPr>
-                          <w:rFonts w:ascii="Helvetica Neue W23 for SKY Reg" w:hAnsi="Helvetica Neue W23 for SKY Reg" w:cs="Helvetica Neue W23 for SKY Reg"/>
+                          <w:rFonts w:ascii="Helvetica Neue W23 for SKY Bd" w:hAnsi="Helvetica Neue W23 for SKY Bd" w:cs="Helvetica Neue W23 for SKY Bd"/>
                           <w:b/>
                           <w:bCs/>
                           <w:color w:val="FFFFFF" w:themeColor="background1"/>
@@ -469,7 +527,7 @@
                         <w:spacing w:after="0" w:line="240" w:lineRule="auto"/>
                         <w:jc w:val="center"/>
                         <w:rPr>
-                          <w:rFonts w:ascii="Helvetica Neue W23 for SKY Reg" w:hAnsi="Helvetica Neue W23 for SKY Reg" w:cs="Helvetica Neue W23 for SKY Reg"/>
+                          <w:rFonts w:ascii="Helvetica Neue W23 for SKY Bd" w:hAnsi="Helvetica Neue W23 for SKY Bd" w:cs="Helvetica Neue W23 for SKY Bd"/>
                           <w:b/>
                           <w:bCs/>
                           <w:color w:val="FFFFFF" w:themeColor="background1"/>
@@ -480,7 +538,7 @@
                       </w:pPr>
                       <w:r>
                         <w:rPr>
-                          <w:rFonts w:ascii="Helvetica Neue W23 for SKY Reg" w:hAnsi="Helvetica Neue W23 for SKY Reg" w:cs="Times New Roman" w:hint="cs"/>
+                          <w:rFonts w:ascii="Helvetica Neue W23 for SKY Bd" w:hAnsi="Helvetica Neue W23 for SKY Bd" w:cs="Helvetica Neue W23 for SKY Bd"/>
                           <w:b/>
                           <w:bCs/>
                           <w:color w:val="FFFFFF" w:themeColor="background1"/>
@@ -488,11 +546,11 @@
                           <w:szCs w:val="44"/>
                           <w:rtl/>
                         </w:rPr>
-                        <w:t xml:space="preserve">للعام الدراسي </w:t>
+                        <w:t>للعام الدراسي 144</w:t>
                       </w:r>
                       <w:r>
                         <w:rPr>
-                          <w:rFonts w:ascii="Helvetica Neue W23 for SKY Reg" w:hAnsi="Helvetica Neue W23 for SKY Reg" w:cs="Helvetica Neue W23 for SKY Reg" w:hint="cs"/>
+                          <w:rFonts w:ascii="Helvetica Neue W23 for SKY Bd" w:hAnsi="Helvetica Neue W23 for SKY Bd" w:cs="Helvetica Neue W23 for SKY Bd" w:hint="cs"/>
                           <w:b/>
                           <w:bCs/>
                           <w:color w:val="FFFFFF" w:themeColor="background1"/>
@@ -500,11 +558,11 @@
                           <w:szCs w:val="44"/>
                           <w:rtl/>
                         </w:rPr>
-                        <w:t>1447</w:t>
+                        <w:t>8</w:t>
                       </w:r>
                       <w:r>
                         <w:rPr>
-                          <w:rFonts w:ascii="Helvetica Neue W23 for SKY Reg" w:hAnsi="Helvetica Neue W23 for SKY Reg" w:cs="Times New Roman" w:hint="cs"/>
+                          <w:rFonts w:ascii="Helvetica Neue W23 for SKY Bd" w:hAnsi="Helvetica Neue W23 for SKY Bd" w:cs="Helvetica Neue W23 for SKY Bd"/>
                           <w:b/>
                           <w:bCs/>
                           <w:color w:val="FFFFFF" w:themeColor="background1"/>
@@ -531,13 +589,13 @@
         <mc:AlternateContent>
           <mc:Choice Requires="wps">
             <w:drawing>
-              <wp:anchor distT="0" distB="0" distL="114300" distR="114300" simplePos="0" relativeHeight="251659264" behindDoc="0" locked="0" layoutInCell="1" allowOverlap="1" wp14:anchorId="249EC347" wp14:editId="77FFBF10">
+              <wp:anchor distT="0" distB="0" distL="114300" distR="114300" simplePos="0" relativeHeight="251667456" behindDoc="0" locked="0" layoutInCell="1" allowOverlap="1" wp14:anchorId="51E25A4E" wp14:editId="01A92E95">
                 <wp:simplePos x="0" y="0"/>
                 <wp:positionH relativeFrom="page">
-                  <wp:posOffset>311785</wp:posOffset>
+                  <wp:posOffset>4206875</wp:posOffset>
                 </wp:positionH>
                 <wp:positionV relativeFrom="page">
-                  <wp:posOffset>110490</wp:posOffset>
+                  <wp:posOffset>400685</wp:posOffset>
                 </wp:positionV>
                 <wp:extent cx="3108960" cy="7040880"/>
                 <wp:effectExtent l="0" t="0" r="0" b="0"/>
@@ -603,7 +661,7 @@
           </mc:Choice>
           <mc:Fallback>
             <w:pict>
-              <v:rect w14:anchorId="6A4988A1" id="مستطيل 261" o:spid="_x0000_s1026" style="position:absolute;left:0;text-align:left;margin-left:24.55pt;margin-top:8.7pt;width:244.8pt;height:554.4pt;flip:x;z-index:251659264;visibility:visible;mso-wrap-style:square;mso-width-percent:400;mso-height-percent:700;mso-wrap-distance-left:9pt;mso-wrap-distance-top:0;mso-wrap-distance-right:9pt;mso-wrap-distance-bottom:0;mso-position-horizontal:absolute;mso-position-horizontal-relative:page;mso-position-vertical:absolute;mso-position-vertical-relative:page;mso-width-percent:400;mso-height-percent:700;mso-width-relative:page;mso-height-relative:page;v-text-anchor:middle" o:gfxdata="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" fillcolor="white [3212]" strokecolor="#747070 [1614]" strokeweight="1.25pt">
+              <v:rect w14:anchorId="54881E0D" id="مستطيل 261" o:spid="_x0000_s1026" style="position:absolute;left:0;text-align:left;margin-left:331.25pt;margin-top:31.55pt;width:244.8pt;height:554.4pt;flip:x;z-index:251667456;visibility:visible;mso-wrap-style:square;mso-width-percent:400;mso-height-percent:700;mso-wrap-distance-left:9pt;mso-wrap-distance-top:0;mso-wrap-distance-right:9pt;mso-wrap-distance-bottom:0;mso-position-horizontal:absolute;mso-position-horizontal-relative:page;mso-position-vertical:absolute;mso-position-vertical-relative:page;mso-width-percent:400;mso-height-percent:700;mso-width-relative:page;mso-height-relative:page;v-text-anchor:middle" o:gfxdata="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" fillcolor="white [3212]" strokecolor="#747070 [1614]" strokeweight="1.25pt">
                 <w10:wrap anchorx="page" anchory="page"/>
               </v:rect>
             </w:pict>
@@ -623,7 +681,6 @@
           <w:docPartUnique/>
         </w:docPartObj>
       </w:sdtPr>
-      <w:sdtEndPr/>
       <w:sdtContent>
         <w:p>
           <w:pPr>
@@ -661,17 +718,225 @@
             <w:rPr>
               <w:rFonts w:ascii="Helvetica Neue W23 for SKY Bd" w:hAnsi="Helvetica Neue W23 for SKY Bd" w:cs="Helvetica Neue W23 for SKY Bd"/>
               <w:noProof/>
+              <w:color w:val="D9D9D9" w:themeColor="background1" w:themeShade="D9"/>
             </w:rPr>
             <mc:AlternateContent>
               <mc:Choice Requires="wps">
                 <w:drawing>
-                  <wp:anchor distT="0" distB="0" distL="114300" distR="114300" simplePos="0" relativeHeight="251662336" behindDoc="0" locked="0" layoutInCell="1" allowOverlap="1" wp14:anchorId="00C88D3D" wp14:editId="415CBEDD">
+                  <wp:anchor distT="0" distB="0" distL="114300" distR="114300" simplePos="0" relativeHeight="251671552" behindDoc="0" locked="0" layoutInCell="1" allowOverlap="1" wp14:anchorId="5E231B1D" wp14:editId="5807D8B5">
                     <wp:simplePos x="0" y="0"/>
                     <wp:positionH relativeFrom="margin">
-                      <wp:align>left</wp:align>
+                      <wp:posOffset>3862070</wp:posOffset>
+                    </wp:positionH>
+                    <wp:positionV relativeFrom="paragraph">
+                      <wp:posOffset>4369435</wp:posOffset>
+                    </wp:positionV>
+                    <wp:extent cx="2711450" cy="133350"/>
+                    <wp:effectExtent l="0" t="0" r="0" b="0"/>
+                    <wp:wrapNone/>
+                    <wp:docPr id="1358706951" name="مستطيل 4"/>
+                    <wp:cNvGraphicFramePr/>
+                    <a:graphic xmlns:a="http://schemas.openxmlformats.org/drawingml/2006/main">
+                      <a:graphicData uri="http://schemas.microsoft.com/office/word/2010/wordprocessingShape">
+                        <wps:wsp>
+                          <wps:cNvSpPr/>
+                          <wps:spPr>
+                            <a:xfrm flipV="1">
+                              <a:off x="0" y="0"/>
+                              <a:ext cx="2711450" cy="133350"/>
+                            </a:xfrm>
+                            <a:prstGeom prst="rect">
+                              <a:avLst/>
+                            </a:prstGeom>
+                            <a:gradFill flip="none" rotWithShape="1">
+                              <a:gsLst>
+                                <a:gs pos="0">
+                                  <a:srgbClr val="08A86A"/>
+                                </a:gs>
+                                <a:gs pos="100000">
+                                  <a:srgbClr val="3D7DBA"/>
+                                </a:gs>
+                              </a:gsLst>
+                              <a:lin ang="0" scaled="1"/>
+                              <a:tileRect/>
+                            </a:gradFill>
+                            <a:ln w="12700" cap="flat" cmpd="sng" algn="ctr">
+                              <a:noFill/>
+                              <a:prstDash val="solid"/>
+                              <a:miter lim="800000"/>
+                            </a:ln>
+                            <a:effectLst/>
+                          </wps:spPr>
+                          <wps:bodyPr rtlCol="1" anchor="ctr"/>
+                        </wps:wsp>
+                      </a:graphicData>
+                    </a:graphic>
+                    <wp14:sizeRelH relativeFrom="margin">
+                      <wp14:pctWidth>0</wp14:pctWidth>
+                    </wp14:sizeRelH>
+                    <wp14:sizeRelV relativeFrom="margin">
+                      <wp14:pctHeight>0</wp14:pctHeight>
+                    </wp14:sizeRelV>
+                  </wp:anchor>
+                </w:drawing>
+              </mc:Choice>
+              <mc:Fallback>
+                <w:pict>
+                  <v:rect w14:anchorId="3B0FB758" id="مستطيل 4" o:spid="_x0000_s1026" style="position:absolute;left:0;text-align:left;margin-left:304.1pt;margin-top:344.05pt;width:213.5pt;height:10.5pt;flip:y;z-index:251671552;visibility:visible;mso-wrap-style:square;mso-width-percent:0;mso-height-percent:0;mso-wrap-distance-left:9pt;mso-wrap-distance-top:0;mso-wrap-distance-right:9pt;mso-wrap-distance-bottom:0;mso-position-horizontal:absolute;mso-position-horizontal-relative:margin;mso-position-vertical:absolute;mso-position-vertical-relative:text;mso-width-percent:0;mso-height-percent:0;mso-width-relative:margin;mso-height-relative:margin;v-text-anchor:middle" o:gfxdata="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" fillcolor="#08a86a" stroked="f" strokeweight="1pt">
+                    <v:fill color2="#3d7dba" rotate="t" angle="90" focus="100%" type="gradient"/>
+                    <w10:wrap anchorx="margin"/>
+                  </v:rect>
+                </w:pict>
+              </mc:Fallback>
+            </mc:AlternateContent>
+          </w:r>
+          <w:r>
+            <w:rPr>
+              <w:rFonts w:ascii="Helvetica Neue W23 for SKY Bd" w:hAnsi="Helvetica Neue W23 for SKY Bd" w:cs="Helvetica Neue W23 for SKY Bd"/>
+              <w:noProof/>
+            </w:rPr>
+            <mc:AlternateContent>
+              <mc:Choice Requires="wps">
+                <w:drawing>
+                  <wp:anchor distT="0" distB="0" distL="114300" distR="114300" simplePos="0" relativeHeight="251669504" behindDoc="0" locked="0" layoutInCell="1" allowOverlap="1" wp14:anchorId="0585A586" wp14:editId="1F3F3DCA">
+                    <wp:simplePos x="0" y="0"/>
+                    <wp:positionH relativeFrom="margin">
+                      <wp:posOffset>3846830</wp:posOffset>
+                    </wp:positionH>
+                    <wp:positionV relativeFrom="page">
+                      <wp:posOffset>4353560</wp:posOffset>
+                    </wp:positionV>
+                    <wp:extent cx="2797810" cy="2475230"/>
+                    <wp:effectExtent l="0" t="0" r="2540" b="0"/>
+                    <wp:wrapSquare wrapText="bothSides"/>
+                    <wp:docPr id="470" name="مربع نص 265"/>
+                    <wp:cNvGraphicFramePr/>
+                    <a:graphic xmlns:a="http://schemas.openxmlformats.org/drawingml/2006/main">
+                      <a:graphicData uri="http://schemas.microsoft.com/office/word/2010/wordprocessingShape">
+                        <wps:wsp>
+                          <wps:cNvSpPr txBox="1"/>
+                          <wps:spPr>
+                            <a:xfrm flipH="1">
+                              <a:off x="0" y="0"/>
+                              <a:ext cx="2797810" cy="2475230"/>
+                            </a:xfrm>
+                            <a:prstGeom prst="rect">
+                              <a:avLst/>
+                            </a:prstGeom>
+                            <a:solidFill>
+                              <a:srgbClr val="C2C1C1"/>
+                            </a:solidFill>
+                            <a:ln w="6350">
+                              <a:noFill/>
+                            </a:ln>
+                            <a:effectLst/>
+                          </wps:spPr>
+                          <wps:txbx>
+                            <w:txbxContent>
+                              <w:p>
+                                <w:pPr>
+                                  <w:pStyle w:val="a7"/>
+                                  <w:numPr>
+                                    <w:ilvl w:val="0"/>
+                                    <w:numId w:val="1"/>
+                                  </w:numPr>
+                                  <w:spacing w:after="0" w:line="240" w:lineRule="auto"/>
+                                  <w:rPr>
+                                    <w:rFonts w:ascii="Helvetica Neue W23 for SKY Bd" w:eastAsiaTheme="majorEastAsia" w:hAnsi="Helvetica Neue W23 for SKY Bd" w:cs="Helvetica Neue W23 for SKY Bd"/>
+                                    <w:b/>
+                                    <w:bCs/>
+                                    <w:color w:val="003400"/>
+                                  </w:rPr>
+                                </w:pPr>
+                                <w:r>
+                                  <w:rPr>
+                                    <w:rFonts w:ascii="Helvetica Neue W23 for SKY Bd" w:eastAsiaTheme="majorEastAsia" w:hAnsi="Helvetica Neue W23 for SKY Bd" w:cs="Helvetica Neue W23 for SKY Bd"/>
+                                    <w:b/>
+                                    <w:bCs/>
+                                    <w:color w:val="003400"/>
+                                    <w:rtl/>
+                                  </w:rPr>
+                                  <w:t>(اللجان – الفرق – التخصصات – الفردية )</w:t>
+                                </w:r>
+                              </w:p>
+                            </w:txbxContent>
+                          </wps:txbx>
+                          <wps:bodyPr rot="0" spcFirstLastPara="0" vertOverflow="overflow" horzOverflow="overflow" vert="horz" wrap="square" lIns="91440" tIns="45720" rIns="91440" bIns="45720" numCol="1" spcCol="0" rtlCol="0" fromWordArt="0" anchor="t" anchorCtr="0" forceAA="0" compatLnSpc="1">
+                            <a:prstTxWarp prst="textNoShape">
+                              <a:avLst/>
+                            </a:prstTxWarp>
+                            <a:spAutoFit/>
+                          </wps:bodyPr>
+                        </wps:wsp>
+                      </a:graphicData>
+                    </a:graphic>
+                    <wp14:sizeRelH relativeFrom="page">
+                      <wp14:pctWidth>36000</wp14:pctWidth>
+                    </wp14:sizeRelH>
+                    <wp14:sizeRelV relativeFrom="page">
+                      <wp14:pctHeight>28000</wp14:pctHeight>
+                    </wp14:sizeRelV>
+                  </wp:anchor>
+                </w:drawing>
+              </mc:Choice>
+              <mc:Fallback>
+                <w:pict>
+                  <v:shapetype w14:anchorId="0585A586" id="_x0000_t202" coordsize="21600,21600" o:spt="202" path="m,l,21600r21600,l21600,xe">
+                    <v:stroke joinstyle="miter"/>
+                    <v:path gradientshapeok="t" o:connecttype="rect"/>
+                  </v:shapetype>
+                  <v:shape id="مربع نص 265" o:spid="_x0000_s1027" type="#_x0000_t202" style="position:absolute;left:0;text-align:left;margin-left:302.9pt;margin-top:342.8pt;width:220.3pt;height:194.9pt;flip:x;z-index:251669504;visibility:visible;mso-wrap-style:square;mso-width-percent:360;mso-height-percent:280;mso-wrap-distance-left:9pt;mso-wrap-distance-top:0;mso-wrap-distance-right:9pt;mso-wrap-distance-bottom:0;mso-position-horizontal:absolute;mso-position-horizontal-relative:margin;mso-position-vertical:absolute;mso-position-vertical-relative:page;mso-width-percent:360;mso-height-percent:280;mso-width-relative:page;mso-height-relative:page;v-text-anchor:top" o:gfxdata="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" fillcolor="#c2c1c1" stroked="f" strokeweight=".5pt">
+                    <v:textbox style="mso-fit-shape-to-text:t">
+                      <w:txbxContent>
+                        <w:p>
+                          <w:pPr>
+                            <w:pStyle w:val="a7"/>
+                            <w:numPr>
+                              <w:ilvl w:val="0"/>
+                              <w:numId w:val="1"/>
+                            </w:numPr>
+                            <w:spacing w:after="0" w:line="240" w:lineRule="auto"/>
+                            <w:rPr>
+                              <w:rFonts w:ascii="Helvetica Neue W23 for SKY Bd" w:eastAsiaTheme="majorEastAsia" w:hAnsi="Helvetica Neue W23 for SKY Bd" w:cs="Helvetica Neue W23 for SKY Bd"/>
+                              <w:b/>
+                              <w:bCs/>
+                              <w:color w:val="003400"/>
+                            </w:rPr>
+                          </w:pPr>
+                          <w:r>
+                            <w:rPr>
+                              <w:rFonts w:ascii="Helvetica Neue W23 for SKY Bd" w:eastAsiaTheme="majorEastAsia" w:hAnsi="Helvetica Neue W23 for SKY Bd" w:cs="Helvetica Neue W23 for SKY Bd"/>
+                              <w:b/>
+                              <w:bCs/>
+                              <w:color w:val="003400"/>
+                              <w:rtl/>
+                            </w:rPr>
+                            <w:t>(اللجان – الفرق – التخصصات – الفردية )</w:t>
+                          </w:r>
+                        </w:p>
+                      </w:txbxContent>
+                    </v:textbox>
+                    <w10:wrap type="square" anchorx="margin" anchory="page"/>
+                  </v:shape>
+                </w:pict>
+              </mc:Fallback>
+            </mc:AlternateContent>
+          </w:r>
+          <w:r>
+            <w:rPr>
+              <w:rFonts w:ascii="Helvetica Neue W23 for SKY Bd" w:hAnsi="Helvetica Neue W23 for SKY Bd" w:cs="Helvetica Neue W23 for SKY Bd"/>
+              <w:noProof/>
+            </w:rPr>
+            <mc:AlternateContent>
+              <mc:Choice Requires="wps">
+                <w:drawing>
+                  <wp:anchor distT="0" distB="0" distL="114300" distR="114300" simplePos="0" relativeHeight="251670528" behindDoc="0" locked="0" layoutInCell="1" allowOverlap="1" wp14:anchorId="71482FBB" wp14:editId="033BEC9A">
+                    <wp:simplePos x="0" y="0"/>
+                    <wp:positionH relativeFrom="margin">
+                      <wp:posOffset>3844290</wp:posOffset>
                     </wp:positionH>
                     <wp:positionV relativeFrom="margin">
-                      <wp:posOffset>2892425</wp:posOffset>
+                      <wp:posOffset>3402965</wp:posOffset>
                     </wp:positionV>
                     <wp:extent cx="2797810" cy="1885950"/>
                     <wp:effectExtent l="0" t="0" r="0" b="0"/>
@@ -722,6 +987,7 @@
                                   </w:rPr>
                                   <w:t>{{</w:t>
                                 </w:r>
+                                <w:proofErr w:type="spellStart"/>
                                 <w:r>
                                   <w:rPr>
                                     <w:rFonts w:ascii="IBM Plex Sans Arabic SemiBold" w:hAnsi="IBM Plex Sans Arabic SemiBold" w:cs="IBM Plex Sans Arabic SemiBold"/>
@@ -733,6 +999,7 @@
                                   </w:rPr>
                                   <w:t>educationalAffairsAgent</w:t>
                                 </w:r>
+                                <w:proofErr w:type="spellEnd"/>
                                 <w:r>
                                   <w:rPr>
                                     <w:rFonts w:ascii="IBM Plex Sans Arabic SemiBold" w:hAnsi="IBM Plex Sans Arabic SemiBold" w:cs="IBM Plex Sans Arabic SemiBold"/>
@@ -768,11 +1035,7 @@
               </mc:Choice>
               <mc:Fallback>
                 <w:pict>
-                  <v:shapetype w14:anchorId="00C88D3D" id="_x0000_t202" coordsize="21600,21600" o:spt="202" path="m,l,21600r21600,l21600,xe">
-                    <v:stroke joinstyle="miter"/>
-                    <v:path gradientshapeok="t" o:connecttype="rect"/>
-                  </v:shapetype>
-                  <v:shape id="مربع نص 255" o:spid="_x0000_s1027" type="#_x0000_t202" style="position:absolute;left:0;text-align:left;margin-left:0;margin-top:227.75pt;width:220.3pt;height:148.5pt;flip:x;z-index:251662336;visibility:visible;mso-wrap-style:square;mso-width-percent:360;mso-height-percent:0;mso-wrap-distance-left:9pt;mso-wrap-distance-top:0;mso-wrap-distance-right:9pt;mso-wrap-distance-bottom:0;mso-position-horizontal:left;mso-position-horizontal-relative:margin;mso-position-vertical:absolute;mso-position-vertical-relative:margin;mso-width-percent:360;mso-height-percent:0;mso-width-relative:page;mso-height-relative:margin;v-text-anchor:bottom" o:gfxdata="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" filled="f" stroked="f" strokeweight=".5pt">
+                  <v:shape w14:anchorId="71482FBB" id="مربع نص 255" o:spid="_x0000_s1028" type="#_x0000_t202" style="position:absolute;left:0;text-align:left;margin-left:302.7pt;margin-top:267.95pt;width:220.3pt;height:148.5pt;flip:x;z-index:251670528;visibility:visible;mso-wrap-style:square;mso-width-percent:360;mso-height-percent:0;mso-wrap-distance-left:9pt;mso-wrap-distance-top:0;mso-wrap-distance-right:9pt;mso-wrap-distance-bottom:0;mso-position-horizontal:absolute;mso-position-horizontal-relative:margin;mso-position-vertical:absolute;mso-position-vertical-relative:margin;mso-width-percent:360;mso-height-percent:0;mso-width-relative:page;mso-height-relative:margin;v-text-anchor:bottom" o:gfxdata="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" filled="f" stroked="f" strokeweight=".5pt">
                     <v:textbox>
                       <w:txbxContent>
                         <w:p>
@@ -836,370 +1099,6 @@
           <w:r>
             <w:rPr>
               <w:rFonts w:ascii="Helvetica Neue W23 for SKY Bd" w:hAnsi="Helvetica Neue W23 for SKY Bd" w:cs="Helvetica Neue W23 for SKY Bd"/>
-              <w:noProof/>
-              <w:color w:val="D9D9D9" w:themeColor="background1" w:themeShade="D9"/>
-            </w:rPr>
-            <mc:AlternateContent>
-              <mc:Choice Requires="wps">
-                <w:drawing>
-                  <wp:anchor distT="0" distB="0" distL="114300" distR="114300" simplePos="0" relativeHeight="251663360" behindDoc="0" locked="0" layoutInCell="1" allowOverlap="1" wp14:anchorId="1190C340" wp14:editId="05E23154">
-                    <wp:simplePos x="0" y="0"/>
-                    <wp:positionH relativeFrom="margin">
-                      <wp:align>left</wp:align>
-                    </wp:positionH>
-                    <wp:positionV relativeFrom="paragraph">
-                      <wp:posOffset>3912235</wp:posOffset>
-                    </wp:positionV>
-                    <wp:extent cx="2711450" cy="133350"/>
-                    <wp:effectExtent l="0" t="0" r="0" b="0"/>
-                    <wp:wrapNone/>
-                    <wp:docPr id="1358706951" name="مستطيل 4"/>
-                    <wp:cNvGraphicFramePr/>
-                    <a:graphic xmlns:a="http://schemas.openxmlformats.org/drawingml/2006/main">
-                      <a:graphicData uri="http://schemas.microsoft.com/office/word/2010/wordprocessingShape">
-                        <wps:wsp>
-                          <wps:cNvSpPr/>
-                          <wps:spPr>
-                            <a:xfrm flipV="1">
-                              <a:off x="0" y="0"/>
-                              <a:ext cx="2711450" cy="133350"/>
-                            </a:xfrm>
-                            <a:prstGeom prst="rect">
-                              <a:avLst/>
-                            </a:prstGeom>
-                            <a:gradFill flip="none" rotWithShape="1">
-                              <a:gsLst>
-                                <a:gs pos="0">
-                                  <a:srgbClr val="08A86A"/>
-                                </a:gs>
-                                <a:gs pos="100000">
-                                  <a:srgbClr val="3D7DBA"/>
-                                </a:gs>
-                              </a:gsLst>
-                              <a:lin ang="0" scaled="1"/>
-                              <a:tileRect/>
-                            </a:gradFill>
-                            <a:ln w="12700" cap="flat" cmpd="sng" algn="ctr">
-                              <a:noFill/>
-                              <a:prstDash val="solid"/>
-                              <a:miter lim="800000"/>
-                            </a:ln>
-                            <a:effectLst/>
-                          </wps:spPr>
-                          <wps:bodyPr rtlCol="1" anchor="ctr"/>
-                        </wps:wsp>
-                      </a:graphicData>
-                    </a:graphic>
-                    <wp14:sizeRelH relativeFrom="margin">
-                      <wp14:pctWidth>0</wp14:pctWidth>
-                    </wp14:sizeRelH>
-                    <wp14:sizeRelV relativeFrom="margin">
-                      <wp14:pctHeight>0</wp14:pctHeight>
-                    </wp14:sizeRelV>
-                  </wp:anchor>
-                </w:drawing>
-              </mc:Choice>
-              <mc:Fallback>
-                <w:pict>
-                  <v:rect w14:anchorId="7CE9FAE4" id="مستطيل 4" o:spid="_x0000_s1026" style="position:absolute;left:0;text-align:left;margin-left:0;margin-top:308.05pt;width:213.5pt;height:10.5pt;flip:y;z-index:251663360;visibility:visible;mso-wrap-style:square;mso-width-percent:0;mso-height-percent:0;mso-wrap-distance-left:9pt;mso-wrap-distance-top:0;mso-wrap-distance-right:9pt;mso-wrap-distance-bottom:0;mso-position-horizontal:left;mso-position-horizontal-relative:margin;mso-position-vertical:absolute;mso-position-vertical-relative:text;mso-width-percent:0;mso-height-percent:0;mso-width-relative:margin;mso-height-relative:margin;v-text-anchor:middle" o:gfxdata="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" fillcolor="#08a86a" stroked="f" strokeweight="1pt">
-                    <v:fill color2="#3d7dba" rotate="t" angle="90" focus="100%" type="gradient"/>
-                    <w10:wrap anchorx="margin"/>
-                  </v:rect>
-                </w:pict>
-              </mc:Fallback>
-            </mc:AlternateContent>
-          </w:r>
-          <w:r>
-            <w:rPr>
-              <w:rFonts w:ascii="Helvetica Neue W23 for SKY Bd" w:hAnsi="Helvetica Neue W23 for SKY Bd" w:cs="Helvetica Neue W23 for SKY Bd"/>
-              <w:noProof/>
-            </w:rPr>
-            <mc:AlternateContent>
-              <mc:Choice Requires="wps">
-                <w:drawing>
-                  <wp:anchor distT="0" distB="0" distL="114300" distR="114300" simplePos="0" relativeHeight="251661312" behindDoc="0" locked="0" layoutInCell="1" allowOverlap="1" wp14:anchorId="22475DA4" wp14:editId="1A2CB970">
-                    <wp:simplePos x="0" y="0"/>
-                    <wp:positionH relativeFrom="margin">
-                      <wp:align>left</wp:align>
-                    </wp:positionH>
-                    <wp:positionV relativeFrom="page">
-                      <wp:posOffset>3661410</wp:posOffset>
-                    </wp:positionV>
-                    <wp:extent cx="2797810" cy="2475230"/>
-                    <wp:effectExtent l="0" t="0" r="2540" b="0"/>
-                    <wp:wrapSquare wrapText="bothSides"/>
-                    <wp:docPr id="470" name="مربع نص 265"/>
-                    <wp:cNvGraphicFramePr/>
-                    <a:graphic xmlns:a="http://schemas.openxmlformats.org/drawingml/2006/main">
-                      <a:graphicData uri="http://schemas.microsoft.com/office/word/2010/wordprocessingShape">
-                        <wps:wsp>
-                          <wps:cNvSpPr txBox="1"/>
-                          <wps:spPr>
-                            <a:xfrm flipH="1">
-                              <a:off x="0" y="0"/>
-                              <a:ext cx="2797810" cy="2475230"/>
-                            </a:xfrm>
-                            <a:prstGeom prst="rect">
-                              <a:avLst/>
-                            </a:prstGeom>
-                            <a:solidFill>
-                              <a:srgbClr val="C2C1C1"/>
-                            </a:solidFill>
-                            <a:ln w="6350">
-                              <a:noFill/>
-                            </a:ln>
-                            <a:effectLst/>
-                          </wps:spPr>
-                          <wps:txbx>
-                            <w:txbxContent>
-                              <w:p>
-                                <w:pPr>
-                                  <w:pStyle w:val="a7"/>
-                                  <w:numPr>
-                                    <w:ilvl w:val="0"/>
-                                    <w:numId w:val="1"/>
-                                  </w:numPr>
-                                  <w:spacing w:after="0" w:line="240" w:lineRule="auto"/>
-                                  <w:rPr>
-                                    <w:rFonts w:ascii="Helvetica Neue W23 for SKY Reg" w:eastAsiaTheme="majorEastAsia" w:hAnsi="Helvetica Neue W23 for SKY Reg" w:cs="Helvetica Neue W23 for SKY Reg"/>
-                                    <w:b/>
-                                    <w:bCs/>
-                                    <w:color w:val="003400"/>
-                                  </w:rPr>
-                                </w:pPr>
-                                <w:r>
-                                  <w:rPr>
-                                    <w:rFonts w:ascii="Helvetica Neue W23 for SKY Reg" w:eastAsiaTheme="majorEastAsia" w:hAnsi="Helvetica Neue W23 for SKY Reg" w:cs="Helvetica Neue W23 for SKY Reg"/>
-                                    <w:b/>
-                                    <w:bCs/>
-                                    <w:color w:val="003400"/>
-                                    <w:rtl/>
-                                  </w:rPr>
-                                  <w:t>(</w:t>
-                                </w:r>
-                                <w:r>
-                                  <w:rPr>
-                                    <w:rFonts w:ascii="Helvetica Neue W23 for SKY Reg" w:eastAsiaTheme="majorEastAsia" w:hAnsi="Helvetica Neue W23 for SKY Reg" w:cs="Times New Roman"/>
-                                    <w:b/>
-                                    <w:bCs/>
-                                    <w:color w:val="003400"/>
-                                    <w:rtl/>
-                                  </w:rPr>
-                                  <w:t xml:space="preserve">اللجان </w:t>
-                                </w:r>
-                                <w:r>
-                                  <w:rPr>
-                                    <w:rFonts w:ascii="Helvetica Neue W23 for SKY Reg" w:eastAsiaTheme="majorEastAsia" w:hAnsi="Helvetica Neue W23 for SKY Reg" w:cs="Helvetica Neue W23 for SKY Reg"/>
-                                    <w:b/>
-                                    <w:bCs/>
-                                    <w:color w:val="003400"/>
-                                    <w:rtl/>
-                                  </w:rPr>
-                                  <w:t xml:space="preserve">– </w:t>
-                                </w:r>
-                                <w:r>
-                                  <w:rPr>
-                                    <w:rFonts w:ascii="Helvetica Neue W23 for SKY Reg" w:eastAsiaTheme="majorEastAsia" w:hAnsi="Helvetica Neue W23 for SKY Reg" w:cs="Times New Roman"/>
-                                    <w:b/>
-                                    <w:bCs/>
-                                    <w:color w:val="003400"/>
-                                    <w:rtl/>
-                                  </w:rPr>
-                                  <w:t xml:space="preserve">الفرق </w:t>
-                                </w:r>
-                                <w:r>
-                                  <w:rPr>
-                                    <w:rFonts w:ascii="Helvetica Neue W23 for SKY Reg" w:eastAsiaTheme="majorEastAsia" w:hAnsi="Helvetica Neue W23 for SKY Reg" w:cs="Helvetica Neue W23 for SKY Reg"/>
-                                    <w:b/>
-                                    <w:bCs/>
-                                    <w:color w:val="003400"/>
-                                    <w:rtl/>
-                                  </w:rPr>
-                                  <w:t xml:space="preserve">– </w:t>
-                                </w:r>
-                                <w:r>
-                                  <w:rPr>
-                                    <w:rFonts w:ascii="Helvetica Neue W23 for SKY Reg" w:eastAsiaTheme="majorEastAsia" w:hAnsi="Helvetica Neue W23 for SKY Reg" w:cs="Times New Roman"/>
-                                    <w:b/>
-                                    <w:bCs/>
-                                    <w:color w:val="003400"/>
-                                    <w:rtl/>
-                                  </w:rPr>
-                                  <w:t xml:space="preserve">التخصصات </w:t>
-                                </w:r>
-                                <w:r>
-                                  <w:rPr>
-                                    <w:rFonts w:ascii="Helvetica Neue W23 for SKY Reg" w:eastAsiaTheme="majorEastAsia" w:hAnsi="Helvetica Neue W23 for SKY Reg" w:cs="Helvetica Neue W23 for SKY Reg"/>
-                                    <w:b/>
-                                    <w:bCs/>
-                                    <w:color w:val="003400"/>
-                                    <w:rtl/>
-                                  </w:rPr>
-                                  <w:t xml:space="preserve">– </w:t>
-                                </w:r>
-                                <w:r>
-                                  <w:rPr>
-                                    <w:rFonts w:ascii="Helvetica Neue W23 for SKY Reg" w:eastAsiaTheme="majorEastAsia" w:hAnsi="Helvetica Neue W23 for SKY Reg" w:cs="Times New Roman"/>
-                                    <w:b/>
-                                    <w:bCs/>
-                                    <w:color w:val="003400"/>
-                                    <w:rtl/>
-                                  </w:rPr>
-                                  <w:t xml:space="preserve">الفردية </w:t>
-                                </w:r>
-                                <w:r>
-                                  <w:rPr>
-                                    <w:rFonts w:ascii="Helvetica Neue W23 for SKY Reg" w:eastAsiaTheme="majorEastAsia" w:hAnsi="Helvetica Neue W23 for SKY Reg" w:cs="Helvetica Neue W23 for SKY Reg"/>
-                                    <w:b/>
-                                    <w:bCs/>
-                                    <w:color w:val="003400"/>
-                                    <w:rtl/>
-                                  </w:rPr>
-                                  <w:t>)</w:t>
-                                </w:r>
-                              </w:p>
-                            </w:txbxContent>
-                          </wps:txbx>
-                          <wps:bodyPr rot="0" spcFirstLastPara="0" vertOverflow="overflow" horzOverflow="overflow" vert="horz" wrap="square" lIns="91440" tIns="45720" rIns="91440" bIns="45720" numCol="1" spcCol="0" rtlCol="0" fromWordArt="0" anchor="t" anchorCtr="0" forceAA="0" compatLnSpc="1">
-                            <a:prstTxWarp prst="textNoShape">
-                              <a:avLst/>
-                            </a:prstTxWarp>
-                            <a:spAutoFit/>
-                          </wps:bodyPr>
-                        </wps:wsp>
-                      </a:graphicData>
-                    </a:graphic>
-                    <wp14:sizeRelH relativeFrom="page">
-                      <wp14:pctWidth>36000</wp14:pctWidth>
-                    </wp14:sizeRelH>
-                    <wp14:sizeRelV relativeFrom="page">
-                      <wp14:pctHeight>28000</wp14:pctHeight>
-                    </wp14:sizeRelV>
-                  </wp:anchor>
-                </w:drawing>
-              </mc:Choice>
-              <mc:Fallback>
-                <w:pict>
-                  <v:shape w14:anchorId="22475DA4" id="مربع نص 265" o:spid="_x0000_s1028" type="#_x0000_t202" style="position:absolute;left:0;text-align:left;margin-left:0;margin-top:288.3pt;width:220.3pt;height:194.9pt;flip:x;z-index:251661312;visibility:visible;mso-wrap-style:square;mso-width-percent:360;mso-height-percent:280;mso-wrap-distance-left:9pt;mso-wrap-distance-top:0;mso-wrap-distance-right:9pt;mso-wrap-distance-bottom:0;mso-position-horizontal:left;mso-position-horizontal-relative:margin;mso-position-vertical:absolute;mso-position-vertical-relative:page;mso-width-percent:360;mso-height-percent:280;mso-width-relative:page;mso-height-relative:page;v-text-anchor:top" o:gfxdata="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" fillcolor="#c2c1c1" stroked="f" strokeweight=".5pt">
-                    <v:textbox style="mso-fit-shape-to-text:t">
-                      <w:txbxContent>
-                        <w:p>
-                          <w:pPr>
-                            <w:pStyle w:val="a7"/>
-                            <w:numPr>
-                              <w:ilvl w:val="0"/>
-                              <w:numId w:val="1"/>
-                            </w:numPr>
-                            <w:spacing w:after="0" w:line="240" w:lineRule="auto"/>
-                            <w:rPr>
-                              <w:rFonts w:ascii="Helvetica Neue W23 for SKY Reg" w:eastAsiaTheme="majorEastAsia" w:hAnsi="Helvetica Neue W23 for SKY Reg" w:cs="Helvetica Neue W23 for SKY Reg"/>
-                              <w:b/>
-                              <w:bCs/>
-                              <w:color w:val="003400"/>
-                            </w:rPr>
-                          </w:pPr>
-                          <w:r>
-                            <w:rPr>
-                              <w:rFonts w:ascii="Helvetica Neue W23 for SKY Reg" w:eastAsiaTheme="majorEastAsia" w:hAnsi="Helvetica Neue W23 for SKY Reg" w:cs="Helvetica Neue W23 for SKY Reg"/>
-                              <w:b/>
-                              <w:bCs/>
-                              <w:color w:val="003400"/>
-                              <w:rtl/>
-                            </w:rPr>
-                            <w:t>(</w:t>
-                          </w:r>
-                          <w:r>
-                            <w:rPr>
-                              <w:rFonts w:ascii="Helvetica Neue W23 for SKY Reg" w:eastAsiaTheme="majorEastAsia" w:hAnsi="Helvetica Neue W23 for SKY Reg" w:cs="Times New Roman"/>
-                              <w:b/>
-                              <w:bCs/>
-                              <w:color w:val="003400"/>
-                              <w:rtl/>
-                            </w:rPr>
-                            <w:t xml:space="preserve">اللجان </w:t>
-                          </w:r>
-                          <w:r>
-                            <w:rPr>
-                              <w:rFonts w:ascii="Helvetica Neue W23 for SKY Reg" w:eastAsiaTheme="majorEastAsia" w:hAnsi="Helvetica Neue W23 for SKY Reg" w:cs="Helvetica Neue W23 for SKY Reg"/>
-                              <w:b/>
-                              <w:bCs/>
-                              <w:color w:val="003400"/>
-                              <w:rtl/>
-                            </w:rPr>
-                            <w:t xml:space="preserve">– </w:t>
-                          </w:r>
-                          <w:r>
-                            <w:rPr>
-                              <w:rFonts w:ascii="Helvetica Neue W23 for SKY Reg" w:eastAsiaTheme="majorEastAsia" w:hAnsi="Helvetica Neue W23 for SKY Reg" w:cs="Times New Roman"/>
-                              <w:b/>
-                              <w:bCs/>
-                              <w:color w:val="003400"/>
-                              <w:rtl/>
-                            </w:rPr>
-                            <w:t xml:space="preserve">الفرق </w:t>
-                          </w:r>
-                          <w:r>
-                            <w:rPr>
-                              <w:rFonts w:ascii="Helvetica Neue W23 for SKY Reg" w:eastAsiaTheme="majorEastAsia" w:hAnsi="Helvetica Neue W23 for SKY Reg" w:cs="Helvetica Neue W23 for SKY Reg"/>
-                              <w:b/>
-                              <w:bCs/>
-                              <w:color w:val="003400"/>
-                              <w:rtl/>
-                            </w:rPr>
-                            <w:t xml:space="preserve">– </w:t>
-                          </w:r>
-                          <w:r>
-                            <w:rPr>
-                              <w:rFonts w:ascii="Helvetica Neue W23 for SKY Reg" w:eastAsiaTheme="majorEastAsia" w:hAnsi="Helvetica Neue W23 for SKY Reg" w:cs="Times New Roman"/>
-                              <w:b/>
-                              <w:bCs/>
-                              <w:color w:val="003400"/>
-                              <w:rtl/>
-                            </w:rPr>
-                            <w:t xml:space="preserve">التخصصات </w:t>
-                          </w:r>
-                          <w:r>
-                            <w:rPr>
-                              <w:rFonts w:ascii="Helvetica Neue W23 for SKY Reg" w:eastAsiaTheme="majorEastAsia" w:hAnsi="Helvetica Neue W23 for SKY Reg" w:cs="Helvetica Neue W23 for SKY Reg"/>
-                              <w:b/>
-                              <w:bCs/>
-                              <w:color w:val="003400"/>
-                              <w:rtl/>
-                            </w:rPr>
-                            <w:t xml:space="preserve">– </w:t>
-                          </w:r>
-                          <w:r>
-                            <w:rPr>
-                              <w:rFonts w:ascii="Helvetica Neue W23 for SKY Reg" w:eastAsiaTheme="majorEastAsia" w:hAnsi="Helvetica Neue W23 for SKY Reg" w:cs="Times New Roman"/>
-                              <w:b/>
-                              <w:bCs/>
-                              <w:color w:val="003400"/>
-                              <w:rtl/>
-                            </w:rPr>
-                            <w:t xml:space="preserve">الفردية </w:t>
-                          </w:r>
-                          <w:r>
-                            <w:rPr>
-                              <w:rFonts w:ascii="Helvetica Neue W23 for SKY Reg" w:eastAsiaTheme="majorEastAsia" w:hAnsi="Helvetica Neue W23 for SKY Reg" w:cs="Helvetica Neue W23 for SKY Reg"/>
-                              <w:b/>
-                              <w:bCs/>
-                              <w:color w:val="003400"/>
-                              <w:rtl/>
-                            </w:rPr>
-                            <w:t>)</w:t>
-                          </w:r>
-                        </w:p>
-                      </w:txbxContent>
-                    </v:textbox>
-                    <w10:wrap type="square" anchorx="margin" anchory="page"/>
-                  </v:shape>
-                </w:pict>
-              </mc:Fallback>
-            </mc:AlternateContent>
-          </w:r>
-          <w:r>
-            <w:rPr>
-              <w:rFonts w:ascii="Helvetica Neue W23 for SKY Bd" w:hAnsi="Helvetica Neue W23 for SKY Bd" w:cs="Helvetica Neue W23 for SKY Bd"/>
               <w:rtl/>
             </w:rPr>
             <w:br w:type="page"/>
@@ -1212,7 +1111,7 @@
         <w:jc w:val="center"/>
         <w:rPr>
           <w:rFonts w:ascii="Helvetica Neue W23 for SKY Bd" w:hAnsi="Helvetica Neue W23 for SKY Bd" w:cs="Helvetica Neue W23 for SKY Bd"/>
-          <w:color w:val="000000"/>
+          <w:color w:val="351375"/>
           <w:sz w:val="24"/>
           <w:szCs w:val="24"/>
           <w:shd w:val="clear" w:color="auto" w:fill="FFFFFF"/>
@@ -1221,16 +1120,101 @@
       </w:pPr>
       <w:r>
         <w:rPr>
+          <w:rFonts w:ascii="Helvetica Neue W23 for SKY Bd" w:hAnsi="Helvetica Neue W23 for SKY Bd" w:cs="Helvetica Neue W23 for SKY Bd"/>
+          <w:noProof/>
+          <w:color w:val="351375"/>
+          <w:sz w:val="24"/>
+          <w:szCs w:val="24"/>
+          <w:shd w:val="clear" w:color="auto" w:fill="FFFFFF"/>
+        </w:rPr>
+        <w:lastRenderedPageBreak/>
+        <mc:AlternateContent>
+          <mc:Choice Requires="wps">
+            <w:drawing>
+              <wp:anchor distT="0" distB="0" distL="114300" distR="114300" simplePos="0" relativeHeight="251665408" behindDoc="0" locked="0" layoutInCell="1" allowOverlap="1" wp14:anchorId="323A809E" wp14:editId="297C052F">
+                <wp:simplePos x="0" y="0"/>
+                <wp:positionH relativeFrom="margin">
+                  <wp:align>center</wp:align>
+                </wp:positionH>
+                <wp:positionV relativeFrom="paragraph">
+                  <wp:posOffset>513715</wp:posOffset>
+                </wp:positionV>
+                <wp:extent cx="3212123" cy="0"/>
+                <wp:effectExtent l="38100" t="38100" r="7620" b="57150"/>
+                <wp:wrapNone/>
+                <wp:docPr id="7" name="موصل مستقيم 6">
+                  <a:extLst xmlns:a="http://schemas.openxmlformats.org/drawingml/2006/main">
+                    <a:ext uri="{FF2B5EF4-FFF2-40B4-BE49-F238E27FC236}">
+                      <a16:creationId xmlns:a16="http://schemas.microsoft.com/office/drawing/2014/main" id="{E1C4DECF-40DB-CC30-D825-FDD9EC6AF7EB}"/>
+                    </a:ext>
+                  </a:extLst>
+                </wp:docPr>
+                <wp:cNvGraphicFramePr>
+                  <a:graphicFrameLocks xmlns:a="http://schemas.openxmlformats.org/drawingml/2006/main"/>
+                </wp:cNvGraphicFramePr>
+                <a:graphic xmlns:a="http://schemas.openxmlformats.org/drawingml/2006/main">
+                  <a:graphicData uri="http://schemas.microsoft.com/office/word/2010/wordprocessingShape">
+                    <wps:wsp>
+                      <wps:cNvCnPr>
+                        <a:cxnSpLocks/>
+                      </wps:cNvCnPr>
+                      <wps:spPr>
+                        <a:xfrm flipH="1">
+                          <a:off x="0" y="0"/>
+                          <a:ext cx="3212123" cy="0"/>
+                        </a:xfrm>
+                        <a:prstGeom prst="line">
+                          <a:avLst/>
+                        </a:prstGeom>
+                        <a:ln w="12700">
+                          <a:solidFill>
+                            <a:srgbClr val="351375"/>
+                          </a:solidFill>
+                          <a:tailEnd type="oval"/>
+                        </a:ln>
+                      </wps:spPr>
+                      <wps:style>
+                        <a:lnRef idx="1">
+                          <a:schemeClr val="accent1"/>
+                        </a:lnRef>
+                        <a:fillRef idx="0">
+                          <a:schemeClr val="accent1"/>
+                        </a:fillRef>
+                        <a:effectRef idx="0">
+                          <a:schemeClr val="accent1"/>
+                        </a:effectRef>
+                        <a:fontRef idx="minor">
+                          <a:schemeClr val="tx1"/>
+                        </a:fontRef>
+                      </wps:style>
+                      <wps:bodyPr/>
+                    </wps:wsp>
+                  </a:graphicData>
+                </a:graphic>
+              </wp:anchor>
+            </w:drawing>
+          </mc:Choice>
+          <mc:Fallback>
+            <w:pict>
+              <v:line w14:anchorId="49EF6749" id="موصل مستقيم 6" o:spid="_x0000_s1026" style="position:absolute;left:0;text-align:left;flip:x;z-index:251665408;visibility:visible;mso-wrap-style:square;mso-wrap-distance-left:9pt;mso-wrap-distance-top:0;mso-wrap-distance-right:9pt;mso-wrap-distance-bottom:0;mso-position-horizontal:center;mso-position-horizontal-relative:margin;mso-position-vertical:absolute;mso-position-vertical-relative:text" from="0,40.45pt" to="252.9pt,40.45pt" o:gfxdata="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" strokecolor="#351375" strokeweight="1pt">
+                <v:stroke endarrow="oval" joinstyle="miter"/>
+                <o:lock v:ext="edit" shapetype="f"/>
+                <w10:wrap anchorx="margin"/>
+              </v:line>
+            </w:pict>
+          </mc:Fallback>
+        </mc:AlternateContent>
+      </w:r>
+      <w:r>
+        <w:rPr>
           <w:rFonts w:ascii="Helvetica Neue W23 for SKY Bd" w:eastAsia="Times New Roman" w:hAnsi="Helvetica Neue W23 for SKY Bd" w:cs="Helvetica Neue W23 for SKY Bd"/>
           <w:b/>
           <w:bCs/>
-          <w:color w:val="FF0000"/>
+          <w:color w:val="351375"/>
           <w:sz w:val="32"/>
           <w:szCs w:val="40"/>
-          <w:u w:val="single"/>
           <w:rtl/>
         </w:rPr>
-        <w:lastRenderedPageBreak/>
         <w:t>اجتماع قسم الرياضيات</w:t>
       </w:r>
     </w:p>
@@ -4027,7 +4011,59 @@
                 <w:rtl/>
                 <w:lang w:eastAsia="ar-SA"/>
               </w:rPr>
-              <w:t>يقوم كل معلم بإعداد وتجهيز ملف خاص فيه ويقوم بتنظيمه وتسليمه لوكيل الشؤون التعليمية ويشمل كل عناصر الأداء الوظيفي الجديد ويحتوي على كل تقارير استراتيجيات التعلم التي يقوم بها داخل الفصل، وانشطة التدريس والخطة التعليمية الأسبوعية للتعلم، ووضع نماذج الاختبارات التشخيصية والتدريبية التي يقيمها للطلاب مع نماذج تحليلها ونماذج من الخطط العلاجية والاثرائية التي يؤديها للطلاب وأيضا على كل المهام والواجبات التي مطلوبه منه من خلال عناصر التقويم للاداء.</w:t>
+              <w:t xml:space="preserve">يقوم كل معلم بإعداد وتجهيز ملف خاص فيه ويقوم بتنظيمه وتسليمه لوكيل الشؤون التعليمية ويشمل كل عناصر الأداء الوظيفي الجديد ويحتوي على كل تقارير استراتيجيات التعلم التي يقوم بها داخل الفصل، وانشطة التدريس والخطة التعليمية الأسبوعية للتعلم، ووضع نماذج الاختبارات التشخيصية والتدريبية التي يقيمها للطلاب مع نماذج تحليلها ونماذج من الخطط العلاجية والاثرائية التي يؤديها للطلاب وأيضا على كل المهام والواجبات التي </w:t>
+            </w:r>
+            <w:proofErr w:type="spellStart"/>
+            <w:r>
+              <w:rPr>
+                <w:rFonts w:ascii="Helvetica Neue W23 for SKY Bd" w:eastAsia="Times New Roman" w:hAnsi="Helvetica Neue W23 for SKY Bd" w:cs="Helvetica Neue W23 for SKY Bd"/>
+                <w:b/>
+                <w:bCs/>
+                <w:sz w:val="18"/>
+                <w:szCs w:val="18"/>
+                <w:rtl/>
+                <w:lang w:eastAsia="ar-SA"/>
+              </w:rPr>
+              <w:t>مطلوبه</w:t>
+            </w:r>
+            <w:proofErr w:type="spellEnd"/>
+            <w:r>
+              <w:rPr>
+                <w:rFonts w:ascii="Helvetica Neue W23 for SKY Bd" w:eastAsia="Times New Roman" w:hAnsi="Helvetica Neue W23 for SKY Bd" w:cs="Helvetica Neue W23 for SKY Bd"/>
+                <w:b/>
+                <w:bCs/>
+                <w:sz w:val="18"/>
+                <w:szCs w:val="18"/>
+                <w:rtl/>
+                <w:lang w:eastAsia="ar-SA"/>
+              </w:rPr>
+              <w:t xml:space="preserve"> منه من خلال عناصر التقويم </w:t>
+            </w:r>
+            <w:proofErr w:type="spellStart"/>
+            <w:r>
+              <w:rPr>
+                <w:rFonts w:ascii="Helvetica Neue W23 for SKY Bd" w:eastAsia="Times New Roman" w:hAnsi="Helvetica Neue W23 for SKY Bd" w:cs="Helvetica Neue W23 for SKY Bd"/>
+                <w:b/>
+                <w:bCs/>
+                <w:sz w:val="18"/>
+                <w:szCs w:val="18"/>
+                <w:rtl/>
+                <w:lang w:eastAsia="ar-SA"/>
+              </w:rPr>
+              <w:t>للاداء</w:t>
+            </w:r>
+            <w:proofErr w:type="spellEnd"/>
+            <w:r>
+              <w:rPr>
+                <w:rFonts w:ascii="Helvetica Neue W23 for SKY Bd" w:eastAsia="Times New Roman" w:hAnsi="Helvetica Neue W23 for SKY Bd" w:cs="Helvetica Neue W23 for SKY Bd"/>
+                <w:b/>
+                <w:bCs/>
+                <w:sz w:val="18"/>
+                <w:szCs w:val="18"/>
+                <w:rtl/>
+                <w:lang w:eastAsia="ar-SA"/>
+              </w:rPr>
+              <w:t>.</w:t>
             </w:r>
           </w:p>
           <w:p>
@@ -4137,6 +4173,34 @@
           <w:lang w:eastAsia="ar-SA"/>
         </w:rPr>
       </w:pPr>
+    </w:p>
+    <w:p>
+      <w:pPr>
+        <w:bidi w:val="0"/>
+        <w:rPr>
+          <w:rFonts w:ascii="Helvetica Neue W23 for SKY Bd" w:eastAsia="Times New Roman" w:hAnsi="Helvetica Neue W23 for SKY Bd" w:cs="Helvetica Neue W23 for SKY Bd"/>
+          <w:b/>
+          <w:bCs/>
+          <w:color w:val="FF0000"/>
+          <w:sz w:val="32"/>
+          <w:szCs w:val="40"/>
+          <w:u w:val="single"/>
+          <w:rtl/>
+        </w:rPr>
+      </w:pPr>
+      <w:r>
+        <w:rPr>
+          <w:rFonts w:ascii="Helvetica Neue W23 for SKY Bd" w:eastAsia="Times New Roman" w:hAnsi="Helvetica Neue W23 for SKY Bd" w:cs="Helvetica Neue W23 for SKY Bd"/>
+          <w:b/>
+          <w:bCs/>
+          <w:color w:val="FF0000"/>
+          <w:sz w:val="32"/>
+          <w:szCs w:val="40"/>
+          <w:u w:val="single"/>
+          <w:rtl/>
+        </w:rPr>
+        <w:br w:type="page"/>
+      </w:r>
     </w:p>
     <w:p>
       <w:pPr>
@@ -4164,23 +4228,9 @@
           <w:u w:val="single"/>
           <w:rtl/>
         </w:rPr>
+        <w:lastRenderedPageBreak/>
         <w:t>اجتماع قسم العلوم</w:t>
       </w:r>
-    </w:p>
-    <w:p>
-      <w:pPr>
-        <w:spacing w:after="0" w:line="240" w:lineRule="auto"/>
-        <w:jc w:val="center"/>
-        <w:rPr>
-          <w:rFonts w:ascii="Helvetica Neue W23 for SKY Bd" w:eastAsia="Times New Roman" w:hAnsi="Helvetica Neue W23 for SKY Bd" w:cs="Helvetica Neue W23 for SKY Bd"/>
-          <w:b/>
-          <w:bCs/>
-          <w:sz w:val="32"/>
-          <w:szCs w:val="40"/>
-          <w:u w:val="single"/>
-          <w:rtl/>
-        </w:rPr>
-      </w:pPr>
     </w:p>
     <w:tbl>
       <w:tblPr>
@@ -4735,7 +4785,6 @@
                 <w:rtl/>
                 <w:lang w:eastAsia="ar-SA"/>
               </w:rPr>
-              <w:lastRenderedPageBreak/>
               <w:t>تخصص .....................................</w:t>
             </w:r>
           </w:p>
@@ -4798,7 +4847,6 @@
                 <w:rtl/>
                 <w:lang w:eastAsia="ar-SA"/>
               </w:rPr>
-              <w:lastRenderedPageBreak/>
               <w:t>الاسم</w:t>
             </w:r>
           </w:p>
@@ -6929,7 +6977,60 @@
                 <w:rtl/>
                 <w:lang w:eastAsia="ar-SA"/>
               </w:rPr>
-              <w:t>يقوم كل معلم بإعداد وتجهيز ملف خاص فيه ويقوم بتنظيمه وتسليمه لوكيل الشؤون التعليمية ويشمل كل عناصر الأداء الوظيفي الجديد ويحتوي على كل تقارير استراتيجيات التعلم التي يقوم بها داخل الفصل، وانشطة التدريس والخطة التعليمية الأسبوعية للتعلم، ووضع نماذج الاختبارات التشخيصية والتدريبية التي يقيمها للطلاب مع نماذج تحليلها ونماذج من الخطط العلاجية والاثرائية التي يؤديها للطلاب وأيضا على كل المهام والواجبات التي مطلوبه منه من خلال عناصر التقويم للاداء.</w:t>
+              <w:lastRenderedPageBreak/>
+              <w:t xml:space="preserve">يقوم كل معلم بإعداد وتجهيز ملف خاص فيه ويقوم بتنظيمه وتسليمه لوكيل الشؤون التعليمية ويشمل كل عناصر الأداء الوظيفي الجديد ويحتوي على كل تقارير استراتيجيات التعلم التي يقوم بها داخل الفصل، وانشطة التدريس والخطة التعليمية الأسبوعية للتعلم، ووضع نماذج الاختبارات التشخيصية والتدريبية التي يقيمها للطلاب مع نماذج تحليلها ونماذج من الخطط العلاجية والاثرائية التي يؤديها للطلاب وأيضا على كل المهام والواجبات التي </w:t>
+            </w:r>
+            <w:proofErr w:type="spellStart"/>
+            <w:r>
+              <w:rPr>
+                <w:rFonts w:ascii="Helvetica Neue W23 for SKY Bd" w:eastAsia="Times New Roman" w:hAnsi="Helvetica Neue W23 for SKY Bd" w:cs="Helvetica Neue W23 for SKY Bd"/>
+                <w:b/>
+                <w:bCs/>
+                <w:sz w:val="18"/>
+                <w:szCs w:val="18"/>
+                <w:rtl/>
+                <w:lang w:eastAsia="ar-SA"/>
+              </w:rPr>
+              <w:t>مطلوبه</w:t>
+            </w:r>
+            <w:proofErr w:type="spellEnd"/>
+            <w:r>
+              <w:rPr>
+                <w:rFonts w:ascii="Helvetica Neue W23 for SKY Bd" w:eastAsia="Times New Roman" w:hAnsi="Helvetica Neue W23 for SKY Bd" w:cs="Helvetica Neue W23 for SKY Bd"/>
+                <w:b/>
+                <w:bCs/>
+                <w:sz w:val="18"/>
+                <w:szCs w:val="18"/>
+                <w:rtl/>
+                <w:lang w:eastAsia="ar-SA"/>
+              </w:rPr>
+              <w:t xml:space="preserve"> منه من خلال عناصر التقويم </w:t>
+            </w:r>
+            <w:proofErr w:type="spellStart"/>
+            <w:r>
+              <w:rPr>
+                <w:rFonts w:ascii="Helvetica Neue W23 for SKY Bd" w:eastAsia="Times New Roman" w:hAnsi="Helvetica Neue W23 for SKY Bd" w:cs="Helvetica Neue W23 for SKY Bd"/>
+                <w:b/>
+                <w:bCs/>
+                <w:sz w:val="18"/>
+                <w:szCs w:val="18"/>
+                <w:rtl/>
+                <w:lang w:eastAsia="ar-SA"/>
+              </w:rPr>
+              <w:t>للاداء</w:t>
+            </w:r>
+            <w:proofErr w:type="spellEnd"/>
+            <w:r>
+              <w:rPr>
+                <w:rFonts w:ascii="Helvetica Neue W23 for SKY Bd" w:eastAsia="Times New Roman" w:hAnsi="Helvetica Neue W23 for SKY Bd" w:cs="Helvetica Neue W23 for SKY Bd"/>
+                <w:b/>
+                <w:bCs/>
+                <w:sz w:val="18"/>
+                <w:szCs w:val="18"/>
+                <w:rtl/>
+                <w:lang w:eastAsia="ar-SA"/>
+              </w:rPr>
+              <w:t>.</w:t>
             </w:r>
           </w:p>
           <w:p>
@@ -7061,6 +7162,34 @@
     </w:p>
     <w:p>
       <w:pPr>
+        <w:bidi w:val="0"/>
+        <w:rPr>
+          <w:rFonts w:ascii="Helvetica Neue W23 for SKY Bd" w:eastAsia="Times New Roman" w:hAnsi="Helvetica Neue W23 for SKY Bd" w:cs="Helvetica Neue W23 for SKY Bd"/>
+          <w:b/>
+          <w:bCs/>
+          <w:color w:val="FF0000"/>
+          <w:sz w:val="32"/>
+          <w:szCs w:val="40"/>
+          <w:u w:val="single"/>
+          <w:rtl/>
+        </w:rPr>
+      </w:pPr>
+      <w:r>
+        <w:rPr>
+          <w:rFonts w:ascii="Helvetica Neue W23 for SKY Bd" w:eastAsia="Times New Roman" w:hAnsi="Helvetica Neue W23 for SKY Bd" w:cs="Helvetica Neue W23 for SKY Bd"/>
+          <w:b/>
+          <w:bCs/>
+          <w:color w:val="FF0000"/>
+          <w:sz w:val="32"/>
+          <w:szCs w:val="40"/>
+          <w:u w:val="single"/>
+          <w:rtl/>
+        </w:rPr>
+        <w:br w:type="page"/>
+      </w:r>
+    </w:p>
+    <w:p>
+      <w:pPr>
         <w:spacing w:after="0" w:line="240" w:lineRule="auto"/>
         <w:jc w:val="center"/>
         <w:rPr>
@@ -7085,6 +7214,7 @@
           <w:u w:val="single"/>
           <w:rtl/>
         </w:rPr>
+        <w:lastRenderedPageBreak/>
         <w:t xml:space="preserve">اجتماع قسم اللغة العربية  </w:t>
       </w:r>
     </w:p>
@@ -9546,6 +9676,7 @@
                 <w:rtl/>
                 <w:lang w:eastAsia="ar-SA"/>
               </w:rPr>
+              <w:lastRenderedPageBreak/>
               <w:t xml:space="preserve">تفعيل التعلم التعاوني واستخدام استراتيجيات التعلم النشط في عملية القاء الدرس للطلاب. </w:t>
             </w:r>
           </w:p>
@@ -9846,7 +9977,6 @@
                 <w:rtl/>
                 <w:lang w:eastAsia="ar-SA"/>
               </w:rPr>
-              <w:lastRenderedPageBreak/>
               <w:t xml:space="preserve">نشر التوعية الدائمة لدى الطلاب بأهمية اختبار نافس على مستوى تصنيف المدرسة وعلى مستوى أهميته لتهيئتهم للمراحل الدراسية القادمة . </w:t>
             </w:r>
           </w:p>
@@ -9877,7 +10007,60 @@
                 <w:rtl/>
                 <w:lang w:eastAsia="ar-SA"/>
               </w:rPr>
-              <w:t>يقوم كل معلم بإعداد وتجهيز ملف خاص فيه ويقوم بتنظيمه وتسليمه لوكيل الشؤون التعليمية ويشمل كل عناصر الأداء الوظيفي الجديد ويحتوي على كل تقارير استراتيجيات التعلم التي يقوم بها داخل الفصل، وانشطة التدريس والخطة التعليمية الأسبوعية للتعلم، ووضع نماذج الاختبارات التشخيصية والتدريبية التي يقيمها للطلاب مع نماذج تحليلها ونماذج من الخطط العلاجية والاثرائية التي يؤديها للطلاب وأيضا على كل المهام والواجبات التي مطلوبه منه من خلال عناصر التقويم للاداء.</w:t>
+              <w:lastRenderedPageBreak/>
+              <w:t xml:space="preserve">يقوم كل معلم بإعداد وتجهيز ملف خاص فيه ويقوم بتنظيمه وتسليمه لوكيل الشؤون التعليمية ويشمل كل عناصر الأداء الوظيفي الجديد ويحتوي على كل تقارير استراتيجيات التعلم التي يقوم بها داخل الفصل، وانشطة التدريس والخطة التعليمية الأسبوعية للتعلم، ووضع نماذج الاختبارات التشخيصية والتدريبية التي يقيمها للطلاب مع نماذج تحليلها ونماذج من الخطط العلاجية والاثرائية التي يؤديها للطلاب وأيضا على كل المهام والواجبات التي </w:t>
+            </w:r>
+            <w:proofErr w:type="spellStart"/>
+            <w:r>
+              <w:rPr>
+                <w:rFonts w:ascii="Helvetica Neue W23 for SKY Bd" w:eastAsia="Times New Roman" w:hAnsi="Helvetica Neue W23 for SKY Bd" w:cs="Helvetica Neue W23 for SKY Bd"/>
+                <w:b/>
+                <w:bCs/>
+                <w:sz w:val="18"/>
+                <w:szCs w:val="18"/>
+                <w:rtl/>
+                <w:lang w:eastAsia="ar-SA"/>
+              </w:rPr>
+              <w:t>مطلوبه</w:t>
+            </w:r>
+            <w:proofErr w:type="spellEnd"/>
+            <w:r>
+              <w:rPr>
+                <w:rFonts w:ascii="Helvetica Neue W23 for SKY Bd" w:eastAsia="Times New Roman" w:hAnsi="Helvetica Neue W23 for SKY Bd" w:cs="Helvetica Neue W23 for SKY Bd"/>
+                <w:b/>
+                <w:bCs/>
+                <w:sz w:val="18"/>
+                <w:szCs w:val="18"/>
+                <w:rtl/>
+                <w:lang w:eastAsia="ar-SA"/>
+              </w:rPr>
+              <w:t xml:space="preserve"> منه من خلال عناصر التقويم </w:t>
+            </w:r>
+            <w:proofErr w:type="spellStart"/>
+            <w:r>
+              <w:rPr>
+                <w:rFonts w:ascii="Helvetica Neue W23 for SKY Bd" w:eastAsia="Times New Roman" w:hAnsi="Helvetica Neue W23 for SKY Bd" w:cs="Helvetica Neue W23 for SKY Bd"/>
+                <w:b/>
+                <w:bCs/>
+                <w:sz w:val="18"/>
+                <w:szCs w:val="18"/>
+                <w:rtl/>
+                <w:lang w:eastAsia="ar-SA"/>
+              </w:rPr>
+              <w:t>للاداء</w:t>
+            </w:r>
+            <w:proofErr w:type="spellEnd"/>
+            <w:r>
+              <w:rPr>
+                <w:rFonts w:ascii="Helvetica Neue W23 for SKY Bd" w:eastAsia="Times New Roman" w:hAnsi="Helvetica Neue W23 for SKY Bd" w:cs="Helvetica Neue W23 for SKY Bd"/>
+                <w:b/>
+                <w:bCs/>
+                <w:sz w:val="18"/>
+                <w:szCs w:val="18"/>
+                <w:rtl/>
+                <w:lang w:eastAsia="ar-SA"/>
+              </w:rPr>
+              <w:t>.</w:t>
             </w:r>
           </w:p>
           <w:p>
@@ -10019,6 +10202,34 @@
     </w:p>
     <w:p>
       <w:pPr>
+        <w:bidi w:val="0"/>
+        <w:rPr>
+          <w:rFonts w:ascii="Helvetica Neue W23 for SKY Bd" w:eastAsia="Times New Roman" w:hAnsi="Helvetica Neue W23 for SKY Bd" w:cs="Helvetica Neue W23 for SKY Bd"/>
+          <w:b/>
+          <w:bCs/>
+          <w:color w:val="FF0000"/>
+          <w:sz w:val="32"/>
+          <w:szCs w:val="40"/>
+          <w:u w:val="single"/>
+          <w:rtl/>
+        </w:rPr>
+      </w:pPr>
+      <w:r>
+        <w:rPr>
+          <w:rFonts w:ascii="Helvetica Neue W23 for SKY Bd" w:eastAsia="Times New Roman" w:hAnsi="Helvetica Neue W23 for SKY Bd" w:cs="Helvetica Neue W23 for SKY Bd"/>
+          <w:b/>
+          <w:bCs/>
+          <w:color w:val="FF0000"/>
+          <w:sz w:val="32"/>
+          <w:szCs w:val="40"/>
+          <w:u w:val="single"/>
+          <w:rtl/>
+        </w:rPr>
+        <w:br w:type="page"/>
+      </w:r>
+    </w:p>
+    <w:p>
+      <w:pPr>
         <w:spacing w:after="0" w:line="240" w:lineRule="auto"/>
         <w:jc w:val="center"/>
         <w:rPr>
@@ -10043,6 +10254,7 @@
           <w:u w:val="single"/>
           <w:rtl/>
         </w:rPr>
+        <w:lastRenderedPageBreak/>
         <w:t xml:space="preserve">اجتماع قسم اللغة الإنجليزية  </w:t>
       </w:r>
     </w:p>
@@ -10599,7 +10811,6 @@
                 <w:rtl/>
                 <w:lang w:eastAsia="ar-SA"/>
               </w:rPr>
-              <w:lastRenderedPageBreak/>
               <w:t>تخصص .....................................</w:t>
             </w:r>
           </w:p>
@@ -10662,7 +10873,6 @@
                 <w:rtl/>
                 <w:lang w:eastAsia="ar-SA"/>
               </w:rPr>
-              <w:lastRenderedPageBreak/>
               <w:t>الاسم</w:t>
             </w:r>
           </w:p>
@@ -12797,7 +13007,20 @@
                 <w:rtl/>
                 <w:lang w:eastAsia="ar-SA"/>
               </w:rPr>
-              <w:t xml:space="preserve">نشر التوعية الدائمة لدى الطلاب بأهمية اختبار نافس على مستوى تصنيف المدرسة وعلى مستوى أهميته لتهيئتهم للمراحل الدراسية القادمة واهمية الاستعداد للاختبارات المركزية والتنظيمات المستجدة في عمليات تقويم الطالب </w:t>
+              <w:t xml:space="preserve">نشر التوعية الدائمة لدى الطلاب بأهمية اختبار نافس على مستوى تصنيف المدرسة وعلى مستوى أهميته لتهيئتهم </w:t>
+            </w:r>
+            <w:r>
+              <w:rPr>
+                <w:rFonts w:ascii="Helvetica Neue W23 for SKY Bd" w:eastAsia="Times New Roman" w:hAnsi="Helvetica Neue W23 for SKY Bd" w:cs="Helvetica Neue W23 for SKY Bd"/>
+                <w:b/>
+                <w:bCs/>
+                <w:sz w:val="18"/>
+                <w:szCs w:val="18"/>
+                <w:rtl/>
+                <w:lang w:eastAsia="ar-SA"/>
+              </w:rPr>
+              <w:lastRenderedPageBreak/>
+              <w:t xml:space="preserve">للمراحل الدراسية القادمة واهمية الاستعداد للاختبارات المركزية والتنظيمات المستجدة في عمليات تقويم الطالب </w:t>
             </w:r>
           </w:p>
           <w:p>
@@ -12827,7 +13050,59 @@
                 <w:rtl/>
                 <w:lang w:eastAsia="ar-SA"/>
               </w:rPr>
-              <w:t>يقوم كل معلم بإعداد وتجهيز ملف خاص فيه ويقوم بتنظيمه وتسليمه لوكيل الشؤون التعليمية ويشمل كل عناصر الأداء الوظيفي الجديد ويحتوي على كل تقارير استراتيجيات التعلم التي يقوم بها داخل الفصل، وانشطة التدريس والخطة التعليمية الأسبوعية للتعلم، ووضع نماذج الاختبارات التشخيصية والتدريبية التي يقيمها للطلاب مع نماذج تحليلها ونماذج من الخطط العلاجية والاثرائية التي يؤديها للطلاب وأيضا على كل المهام والواجبات التي مطلوبه منه من خلال عناصر التقويم للاداء.</w:t>
+              <w:t xml:space="preserve">يقوم كل معلم بإعداد وتجهيز ملف خاص فيه ويقوم بتنظيمه وتسليمه لوكيل الشؤون التعليمية ويشمل كل عناصر الأداء الوظيفي الجديد ويحتوي على كل تقارير استراتيجيات التعلم التي يقوم بها داخل الفصل، وانشطة التدريس والخطة التعليمية الأسبوعية للتعلم، ووضع نماذج الاختبارات التشخيصية والتدريبية التي يقيمها للطلاب مع نماذج تحليلها ونماذج من الخطط العلاجية والاثرائية التي يؤديها للطلاب وأيضا على كل المهام والواجبات التي </w:t>
+            </w:r>
+            <w:proofErr w:type="spellStart"/>
+            <w:r>
+              <w:rPr>
+                <w:rFonts w:ascii="Helvetica Neue W23 for SKY Bd" w:eastAsia="Times New Roman" w:hAnsi="Helvetica Neue W23 for SKY Bd" w:cs="Helvetica Neue W23 for SKY Bd"/>
+                <w:b/>
+                <w:bCs/>
+                <w:sz w:val="18"/>
+                <w:szCs w:val="18"/>
+                <w:rtl/>
+                <w:lang w:eastAsia="ar-SA"/>
+              </w:rPr>
+              <w:t>مطلوبه</w:t>
+            </w:r>
+            <w:proofErr w:type="spellEnd"/>
+            <w:r>
+              <w:rPr>
+                <w:rFonts w:ascii="Helvetica Neue W23 for SKY Bd" w:eastAsia="Times New Roman" w:hAnsi="Helvetica Neue W23 for SKY Bd" w:cs="Helvetica Neue W23 for SKY Bd"/>
+                <w:b/>
+                <w:bCs/>
+                <w:sz w:val="18"/>
+                <w:szCs w:val="18"/>
+                <w:rtl/>
+                <w:lang w:eastAsia="ar-SA"/>
+              </w:rPr>
+              <w:t xml:space="preserve"> منه من خلال عناصر التقويم </w:t>
+            </w:r>
+            <w:proofErr w:type="spellStart"/>
+            <w:r>
+              <w:rPr>
+                <w:rFonts w:ascii="Helvetica Neue W23 for SKY Bd" w:eastAsia="Times New Roman" w:hAnsi="Helvetica Neue W23 for SKY Bd" w:cs="Helvetica Neue W23 for SKY Bd"/>
+                <w:b/>
+                <w:bCs/>
+                <w:sz w:val="18"/>
+                <w:szCs w:val="18"/>
+                <w:rtl/>
+                <w:lang w:eastAsia="ar-SA"/>
+              </w:rPr>
+              <w:t>للاداء</w:t>
+            </w:r>
+            <w:proofErr w:type="spellEnd"/>
+            <w:r>
+              <w:rPr>
+                <w:rFonts w:ascii="Helvetica Neue W23 for SKY Bd" w:eastAsia="Times New Roman" w:hAnsi="Helvetica Neue W23 for SKY Bd" w:cs="Helvetica Neue W23 for SKY Bd"/>
+                <w:b/>
+                <w:bCs/>
+                <w:sz w:val="18"/>
+                <w:szCs w:val="18"/>
+                <w:rtl/>
+                <w:lang w:eastAsia="ar-SA"/>
+              </w:rPr>
+              <w:t>.</w:t>
             </w:r>
           </w:p>
           <w:p>
@@ -12938,6 +13213,34 @@
           <w:lang w:eastAsia="ar-SA"/>
         </w:rPr>
       </w:pPr>
+    </w:p>
+    <w:p>
+      <w:pPr>
+        <w:bidi w:val="0"/>
+        <w:rPr>
+          <w:rFonts w:ascii="Helvetica Neue W23 for SKY Bd" w:eastAsia="Times New Roman" w:hAnsi="Helvetica Neue W23 for SKY Bd" w:cs="Helvetica Neue W23 for SKY Bd"/>
+          <w:b/>
+          <w:bCs/>
+          <w:color w:val="FF0000"/>
+          <w:sz w:val="32"/>
+          <w:szCs w:val="40"/>
+          <w:u w:val="single"/>
+          <w:rtl/>
+        </w:rPr>
+      </w:pPr>
+      <w:r>
+        <w:rPr>
+          <w:rFonts w:ascii="Helvetica Neue W23 for SKY Bd" w:eastAsia="Times New Roman" w:hAnsi="Helvetica Neue W23 for SKY Bd" w:cs="Helvetica Neue W23 for SKY Bd"/>
+          <w:b/>
+          <w:bCs/>
+          <w:color w:val="FF0000"/>
+          <w:sz w:val="32"/>
+          <w:szCs w:val="40"/>
+          <w:u w:val="single"/>
+          <w:rtl/>
+        </w:rPr>
+        <w:br w:type="page"/>
+      </w:r>
     </w:p>
     <w:p>
       <w:pPr>
@@ -12965,6 +13268,7 @@
           <w:u w:val="single"/>
           <w:rtl/>
         </w:rPr>
+        <w:lastRenderedPageBreak/>
         <w:t xml:space="preserve">اجتماع قسم الدراسات الإسلامية  </w:t>
       </w:r>
     </w:p>
@@ -15757,7 +16061,33 @@
                 <w:rtl/>
                 <w:lang w:eastAsia="ar-SA"/>
               </w:rPr>
-              <w:t>يقوم معلمي القسم بتهيئة بشرح وتهيئة الطلاب لعملية التقويم الجديدة للمادة وكيفية اجراء الاختبارات وتقييمها حسب لا ئحة التقويم الجديدة.</w:t>
+              <w:t xml:space="preserve">يقوم معلمي القسم بتهيئة بشرح وتهيئة الطلاب لعملية التقويم الجديدة للمادة وكيفية اجراء الاختبارات وتقييمها حسب لا </w:t>
+            </w:r>
+            <w:proofErr w:type="spellStart"/>
+            <w:r>
+              <w:rPr>
+                <w:rFonts w:ascii="Helvetica Neue W23 for SKY Bd" w:eastAsia="Times New Roman" w:hAnsi="Helvetica Neue W23 for SKY Bd" w:cs="Helvetica Neue W23 for SKY Bd"/>
+                <w:b/>
+                <w:bCs/>
+                <w:sz w:val="18"/>
+                <w:szCs w:val="18"/>
+                <w:rtl/>
+                <w:lang w:eastAsia="ar-SA"/>
+              </w:rPr>
+              <w:t>ئحة</w:t>
+            </w:r>
+            <w:proofErr w:type="spellEnd"/>
+            <w:r>
+              <w:rPr>
+                <w:rFonts w:ascii="Helvetica Neue W23 for SKY Bd" w:eastAsia="Times New Roman" w:hAnsi="Helvetica Neue W23 for SKY Bd" w:cs="Helvetica Neue W23 for SKY Bd"/>
+                <w:b/>
+                <w:bCs/>
+                <w:sz w:val="18"/>
+                <w:szCs w:val="18"/>
+                <w:rtl/>
+                <w:lang w:eastAsia="ar-SA"/>
+              </w:rPr>
+              <w:t xml:space="preserve"> التقويم الجديدة.</w:t>
             </w:r>
           </w:p>
           <w:p>
@@ -15817,7 +16147,60 @@
                 <w:rtl/>
                 <w:lang w:eastAsia="ar-SA"/>
               </w:rPr>
-              <w:t>يقوم كل معلم بإعداد وتجهيز ملف خاص فيه ويقوم بتنظيمه وتسليمه لوكيل الشؤون التعليمية ويشمل كل عناصر الأداء الوظيفي الجديد ويحتوي على كل تقارير استراتيجيات التعلم التي يقوم بها داخل الفصل، وانشطة التدريس والخطة التعليمية الأسبوعية للتعلم، ووضع نماذج الاختبارات التشخيصية والتدريبية التي يقيمها للطلاب مع نماذج تحليلها ونماذج من الخطط العلاجية والاثرائية التي يؤديها للطلاب وأيضا على كل المهام والواجبات التي مطلوبه منه من خلال عناصر التقويم للاداء.</w:t>
+              <w:lastRenderedPageBreak/>
+              <w:t xml:space="preserve">يقوم كل معلم بإعداد وتجهيز ملف خاص فيه ويقوم بتنظيمه وتسليمه لوكيل الشؤون التعليمية ويشمل كل عناصر الأداء الوظيفي الجديد ويحتوي على كل تقارير استراتيجيات التعلم التي يقوم بها داخل الفصل، وانشطة التدريس والخطة التعليمية الأسبوعية للتعلم، ووضع نماذج الاختبارات التشخيصية والتدريبية التي يقيمها للطلاب مع نماذج تحليلها ونماذج من الخطط العلاجية والاثرائية التي يؤديها للطلاب وأيضا على كل المهام والواجبات التي </w:t>
+            </w:r>
+            <w:proofErr w:type="spellStart"/>
+            <w:r>
+              <w:rPr>
+                <w:rFonts w:ascii="Helvetica Neue W23 for SKY Bd" w:eastAsia="Times New Roman" w:hAnsi="Helvetica Neue W23 for SKY Bd" w:cs="Helvetica Neue W23 for SKY Bd"/>
+                <w:b/>
+                <w:bCs/>
+                <w:sz w:val="18"/>
+                <w:szCs w:val="18"/>
+                <w:rtl/>
+                <w:lang w:eastAsia="ar-SA"/>
+              </w:rPr>
+              <w:t>مطلوبه</w:t>
+            </w:r>
+            <w:proofErr w:type="spellEnd"/>
+            <w:r>
+              <w:rPr>
+                <w:rFonts w:ascii="Helvetica Neue W23 for SKY Bd" w:eastAsia="Times New Roman" w:hAnsi="Helvetica Neue W23 for SKY Bd" w:cs="Helvetica Neue W23 for SKY Bd"/>
+                <w:b/>
+                <w:bCs/>
+                <w:sz w:val="18"/>
+                <w:szCs w:val="18"/>
+                <w:rtl/>
+                <w:lang w:eastAsia="ar-SA"/>
+              </w:rPr>
+              <w:t xml:space="preserve"> منه من خلال عناصر التقويم </w:t>
+            </w:r>
+            <w:proofErr w:type="spellStart"/>
+            <w:r>
+              <w:rPr>
+                <w:rFonts w:ascii="Helvetica Neue W23 for SKY Bd" w:eastAsia="Times New Roman" w:hAnsi="Helvetica Neue W23 for SKY Bd" w:cs="Helvetica Neue W23 for SKY Bd"/>
+                <w:b/>
+                <w:bCs/>
+                <w:sz w:val="18"/>
+                <w:szCs w:val="18"/>
+                <w:rtl/>
+                <w:lang w:eastAsia="ar-SA"/>
+              </w:rPr>
+              <w:t>للاداء</w:t>
+            </w:r>
+            <w:proofErr w:type="spellEnd"/>
+            <w:r>
+              <w:rPr>
+                <w:rFonts w:ascii="Helvetica Neue W23 for SKY Bd" w:eastAsia="Times New Roman" w:hAnsi="Helvetica Neue W23 for SKY Bd" w:cs="Helvetica Neue W23 for SKY Bd"/>
+                <w:b/>
+                <w:bCs/>
+                <w:sz w:val="18"/>
+                <w:szCs w:val="18"/>
+                <w:rtl/>
+                <w:lang w:eastAsia="ar-SA"/>
+              </w:rPr>
+              <w:t>.</w:t>
             </w:r>
           </w:p>
           <w:p>
@@ -15963,6 +16346,34 @@
     </w:p>
     <w:p>
       <w:pPr>
+        <w:bidi w:val="0"/>
+        <w:rPr>
+          <w:rFonts w:ascii="Helvetica Neue W23 for SKY Bd" w:eastAsia="Times New Roman" w:hAnsi="Helvetica Neue W23 for SKY Bd" w:cs="Helvetica Neue W23 for SKY Bd"/>
+          <w:b/>
+          <w:bCs/>
+          <w:color w:val="FF0000"/>
+          <w:sz w:val="32"/>
+          <w:szCs w:val="40"/>
+          <w:u w:val="single"/>
+          <w:rtl/>
+        </w:rPr>
+      </w:pPr>
+      <w:r>
+        <w:rPr>
+          <w:rFonts w:ascii="Helvetica Neue W23 for SKY Bd" w:eastAsia="Times New Roman" w:hAnsi="Helvetica Neue W23 for SKY Bd" w:cs="Helvetica Neue W23 for SKY Bd"/>
+          <w:b/>
+          <w:bCs/>
+          <w:color w:val="FF0000"/>
+          <w:sz w:val="32"/>
+          <w:szCs w:val="40"/>
+          <w:u w:val="single"/>
+          <w:rtl/>
+        </w:rPr>
+        <w:br w:type="page"/>
+      </w:r>
+    </w:p>
+    <w:p>
+      <w:pPr>
         <w:spacing w:after="0" w:line="240" w:lineRule="auto"/>
         <w:jc w:val="center"/>
         <w:rPr>
@@ -15987,6 +16398,7 @@
           <w:u w:val="single"/>
           <w:rtl/>
         </w:rPr>
+        <w:lastRenderedPageBreak/>
         <w:t xml:space="preserve">اجتماع قسم المهارات الرقمية  </w:t>
       </w:r>
     </w:p>
@@ -18686,7 +19098,33 @@
                 <w:rtl/>
                 <w:lang w:eastAsia="ar-SA"/>
               </w:rPr>
-              <w:t>يقوم معلمي القسم بتهيئة بشرح وتهيئة الطلاب لعملية التقويم الجديدة للمادة وكيفية اجراء الاختبارات وتقييمها حسب لا ئحة التقويم الجديدة.</w:t>
+              <w:t xml:space="preserve">يقوم معلمي القسم بتهيئة بشرح وتهيئة الطلاب لعملية التقويم الجديدة للمادة وكيفية اجراء الاختبارات وتقييمها حسب لا </w:t>
+            </w:r>
+            <w:proofErr w:type="spellStart"/>
+            <w:r>
+              <w:rPr>
+                <w:rFonts w:ascii="Helvetica Neue W23 for SKY Bd" w:eastAsia="Times New Roman" w:hAnsi="Helvetica Neue W23 for SKY Bd" w:cs="Helvetica Neue W23 for SKY Bd"/>
+                <w:b/>
+                <w:bCs/>
+                <w:sz w:val="18"/>
+                <w:szCs w:val="18"/>
+                <w:rtl/>
+                <w:lang w:eastAsia="ar-SA"/>
+              </w:rPr>
+              <w:t>ئحة</w:t>
+            </w:r>
+            <w:proofErr w:type="spellEnd"/>
+            <w:r>
+              <w:rPr>
+                <w:rFonts w:ascii="Helvetica Neue W23 for SKY Bd" w:eastAsia="Times New Roman" w:hAnsi="Helvetica Neue W23 for SKY Bd" w:cs="Helvetica Neue W23 for SKY Bd"/>
+                <w:b/>
+                <w:bCs/>
+                <w:sz w:val="18"/>
+                <w:szCs w:val="18"/>
+                <w:rtl/>
+                <w:lang w:eastAsia="ar-SA"/>
+              </w:rPr>
+              <w:t xml:space="preserve"> التقويم الجديدة.</w:t>
             </w:r>
           </w:p>
           <w:p>
@@ -18746,7 +19184,60 @@
                 <w:rtl/>
                 <w:lang w:eastAsia="ar-SA"/>
               </w:rPr>
-              <w:t>يقوم كل معلم بإعداد وتجهيز ملف خاص فيه ويقوم بتنظيمه وتسليمه لوكيل الشؤون التعليمية ويشمل كل عناصر الأداء الوظيفي الجديد ويحتوي على كل تقارير استراتيجيات التعلم التي يقوم بها داخل الفصل، وانشطة التدريس والخطة التعليمية الأسبوعية للتعلم، ووضع نماذج الاختبارات التشخيصية والتدريبية التي يقيمها للطلاب مع نماذج تحليلها ونماذج من الخطط العلاجية والاثرائية التي يؤديها للطلاب وأيضا على كل المهام والواجبات التي مطلوبه منه من خلال عناصر التقويم للاداء.</w:t>
+              <w:lastRenderedPageBreak/>
+              <w:t xml:space="preserve">يقوم كل معلم بإعداد وتجهيز ملف خاص فيه ويقوم بتنظيمه وتسليمه لوكيل الشؤون التعليمية ويشمل كل عناصر الأداء الوظيفي الجديد ويحتوي على كل تقارير استراتيجيات التعلم التي يقوم بها داخل الفصل، وانشطة التدريس والخطة التعليمية الأسبوعية للتعلم، ووضع نماذج الاختبارات التشخيصية والتدريبية التي يقيمها للطلاب مع نماذج تحليلها ونماذج من الخطط العلاجية والاثرائية التي يؤديها للطلاب وأيضا على كل المهام والواجبات التي </w:t>
+            </w:r>
+            <w:proofErr w:type="spellStart"/>
+            <w:r>
+              <w:rPr>
+                <w:rFonts w:ascii="Helvetica Neue W23 for SKY Bd" w:eastAsia="Times New Roman" w:hAnsi="Helvetica Neue W23 for SKY Bd" w:cs="Helvetica Neue W23 for SKY Bd"/>
+                <w:b/>
+                <w:bCs/>
+                <w:sz w:val="18"/>
+                <w:szCs w:val="18"/>
+                <w:rtl/>
+                <w:lang w:eastAsia="ar-SA"/>
+              </w:rPr>
+              <w:t>مطلوبه</w:t>
+            </w:r>
+            <w:proofErr w:type="spellEnd"/>
+            <w:r>
+              <w:rPr>
+                <w:rFonts w:ascii="Helvetica Neue W23 for SKY Bd" w:eastAsia="Times New Roman" w:hAnsi="Helvetica Neue W23 for SKY Bd" w:cs="Helvetica Neue W23 for SKY Bd"/>
+                <w:b/>
+                <w:bCs/>
+                <w:sz w:val="18"/>
+                <w:szCs w:val="18"/>
+                <w:rtl/>
+                <w:lang w:eastAsia="ar-SA"/>
+              </w:rPr>
+              <w:t xml:space="preserve"> منه من خلال عناصر التقويم </w:t>
+            </w:r>
+            <w:proofErr w:type="spellStart"/>
+            <w:r>
+              <w:rPr>
+                <w:rFonts w:ascii="Helvetica Neue W23 for SKY Bd" w:eastAsia="Times New Roman" w:hAnsi="Helvetica Neue W23 for SKY Bd" w:cs="Helvetica Neue W23 for SKY Bd"/>
+                <w:b/>
+                <w:bCs/>
+                <w:sz w:val="18"/>
+                <w:szCs w:val="18"/>
+                <w:rtl/>
+                <w:lang w:eastAsia="ar-SA"/>
+              </w:rPr>
+              <w:t>للاداء</w:t>
+            </w:r>
+            <w:proofErr w:type="spellEnd"/>
+            <w:r>
+              <w:rPr>
+                <w:rFonts w:ascii="Helvetica Neue W23 for SKY Bd" w:eastAsia="Times New Roman" w:hAnsi="Helvetica Neue W23 for SKY Bd" w:cs="Helvetica Neue W23 for SKY Bd"/>
+                <w:b/>
+                <w:bCs/>
+                <w:sz w:val="18"/>
+                <w:szCs w:val="18"/>
+                <w:rtl/>
+                <w:lang w:eastAsia="ar-SA"/>
+              </w:rPr>
+              <w:t>.</w:t>
             </w:r>
           </w:p>
           <w:p>
@@ -18845,6 +19336,7 @@
           <w:rtl/>
           <w:lang w:eastAsia="ar-SA"/>
         </w:rPr>
+        <w:lastRenderedPageBreak/>
         <w:t xml:space="preserve"> </w:t>
       </w:r>
     </w:p>
@@ -18876,6 +19368,34 @@
           <w:lang w:eastAsia="ar-SA"/>
         </w:rPr>
       </w:pPr>
+    </w:p>
+    <w:p>
+      <w:pPr>
+        <w:bidi w:val="0"/>
+        <w:rPr>
+          <w:rFonts w:ascii="Helvetica Neue W23 for SKY Bd" w:eastAsia="Times New Roman" w:hAnsi="Helvetica Neue W23 for SKY Bd" w:cs="Helvetica Neue W23 for SKY Bd"/>
+          <w:b/>
+          <w:bCs/>
+          <w:color w:val="FF0000"/>
+          <w:sz w:val="32"/>
+          <w:szCs w:val="40"/>
+          <w:u w:val="single"/>
+          <w:rtl/>
+        </w:rPr>
+      </w:pPr>
+      <w:r>
+        <w:rPr>
+          <w:rFonts w:ascii="Helvetica Neue W23 for SKY Bd" w:eastAsia="Times New Roman" w:hAnsi="Helvetica Neue W23 for SKY Bd" w:cs="Helvetica Neue W23 for SKY Bd"/>
+          <w:b/>
+          <w:bCs/>
+          <w:color w:val="FF0000"/>
+          <w:sz w:val="32"/>
+          <w:szCs w:val="40"/>
+          <w:u w:val="single"/>
+          <w:rtl/>
+        </w:rPr>
+        <w:br w:type="page"/>
+      </w:r>
     </w:p>
     <w:p>
       <w:pPr>
@@ -18903,6 +19423,7 @@
           <w:u w:val="single"/>
           <w:rtl/>
         </w:rPr>
+        <w:lastRenderedPageBreak/>
         <w:t xml:space="preserve">اجتماع قسم الاجتماعيات   </w:t>
       </w:r>
     </w:p>
@@ -21819,7 +22340,33 @@
                 <w:rtl/>
                 <w:lang w:eastAsia="ar-SA"/>
               </w:rPr>
-              <w:t>يقوم معلمي القسم بتهيئة بشرح وتهيئة الطلاب لعملية التقويم الجديدة للمادة وكيفية اجراء الاختبارات وتقييمها حسب لا ئحة التقويم الجديدة.</w:t>
+              <w:t xml:space="preserve">يقوم معلمي القسم بتهيئة بشرح وتهيئة الطلاب لعملية التقويم الجديدة للمادة وكيفية اجراء الاختبارات وتقييمها حسب لا </w:t>
+            </w:r>
+            <w:proofErr w:type="spellStart"/>
+            <w:r>
+              <w:rPr>
+                <w:rFonts w:ascii="Helvetica Neue W23 for SKY Bd" w:eastAsia="Times New Roman" w:hAnsi="Helvetica Neue W23 for SKY Bd" w:cs="Helvetica Neue W23 for SKY Bd"/>
+                <w:b/>
+                <w:bCs/>
+                <w:sz w:val="18"/>
+                <w:szCs w:val="18"/>
+                <w:rtl/>
+                <w:lang w:eastAsia="ar-SA"/>
+              </w:rPr>
+              <w:t>ئحة</w:t>
+            </w:r>
+            <w:proofErr w:type="spellEnd"/>
+            <w:r>
+              <w:rPr>
+                <w:rFonts w:ascii="Helvetica Neue W23 for SKY Bd" w:eastAsia="Times New Roman" w:hAnsi="Helvetica Neue W23 for SKY Bd" w:cs="Helvetica Neue W23 for SKY Bd"/>
+                <w:b/>
+                <w:bCs/>
+                <w:sz w:val="18"/>
+                <w:szCs w:val="18"/>
+                <w:rtl/>
+                <w:lang w:eastAsia="ar-SA"/>
+              </w:rPr>
+              <w:t xml:space="preserve"> التقويم الجديدة.</w:t>
             </w:r>
           </w:p>
           <w:p>
@@ -21849,7 +22396,20 @@
                 <w:rtl/>
                 <w:lang w:eastAsia="ar-SA"/>
               </w:rPr>
-              <w:t xml:space="preserve">نشر التوعية الدائمة لدى الطلاب بأهمية اختبار نافس على مستوى تصنيف المدرسة وعلى مستوى أهميته لتهيئتهم للمراحل الدراسية القادمة واهمية الاستعداد للاختبارات المركزية والتنظيمات المستجدة في عمليات تقويم الطالب </w:t>
+              <w:t xml:space="preserve">نشر التوعية الدائمة لدى الطلاب بأهمية اختبار نافس على مستوى تصنيف المدرسة وعلى مستوى أهميته لتهيئتهم </w:t>
+            </w:r>
+            <w:r>
+              <w:rPr>
+                <w:rFonts w:ascii="Helvetica Neue W23 for SKY Bd" w:eastAsia="Times New Roman" w:hAnsi="Helvetica Neue W23 for SKY Bd" w:cs="Helvetica Neue W23 for SKY Bd"/>
+                <w:b/>
+                <w:bCs/>
+                <w:sz w:val="18"/>
+                <w:szCs w:val="18"/>
+                <w:rtl/>
+                <w:lang w:eastAsia="ar-SA"/>
+              </w:rPr>
+              <w:lastRenderedPageBreak/>
+              <w:t xml:space="preserve">للمراحل الدراسية القادمة واهمية الاستعداد للاختبارات المركزية والتنظيمات المستجدة في عمليات تقويم الطالب </w:t>
             </w:r>
           </w:p>
           <w:p>
@@ -21879,7 +22439,59 @@
                 <w:rtl/>
                 <w:lang w:eastAsia="ar-SA"/>
               </w:rPr>
-              <w:t>يقوم كل معلم بإعداد وتجهيز ملف خاص فيه ويقوم بتنظيمه وتسليمه لوكيل الشؤون التعليمية ويشمل كل عناصر الأداء الوظيفي الجديد ويحتوي على كل تقارير استراتيجيات التعلم التي يقوم بها داخل الفصل، وانشطة التدريس والخطة التعليمية الأسبوعية للتعلم، ووضع نماذج الاختبارات التشخيصية والتدريبية التي يقيمها للطلاب مع نماذج تحليلها ونماذج من الخطط العلاجية والاثرائية التي يؤديها للطلاب وأيضا على كل المهام والواجبات التي مطلوبه منه من خلال عناصر التقويم للاداء.</w:t>
+              <w:t xml:space="preserve">يقوم كل معلم بإعداد وتجهيز ملف خاص فيه ويقوم بتنظيمه وتسليمه لوكيل الشؤون التعليمية ويشمل كل عناصر الأداء الوظيفي الجديد ويحتوي على كل تقارير استراتيجيات التعلم التي يقوم بها داخل الفصل، وانشطة التدريس والخطة التعليمية الأسبوعية للتعلم، ووضع نماذج الاختبارات التشخيصية والتدريبية التي يقيمها للطلاب مع نماذج تحليلها ونماذج من الخطط العلاجية والاثرائية التي يؤديها للطلاب وأيضا على كل المهام والواجبات التي </w:t>
+            </w:r>
+            <w:proofErr w:type="spellStart"/>
+            <w:r>
+              <w:rPr>
+                <w:rFonts w:ascii="Helvetica Neue W23 for SKY Bd" w:eastAsia="Times New Roman" w:hAnsi="Helvetica Neue W23 for SKY Bd" w:cs="Helvetica Neue W23 for SKY Bd"/>
+                <w:b/>
+                <w:bCs/>
+                <w:sz w:val="18"/>
+                <w:szCs w:val="18"/>
+                <w:rtl/>
+                <w:lang w:eastAsia="ar-SA"/>
+              </w:rPr>
+              <w:t>مطلوبه</w:t>
+            </w:r>
+            <w:proofErr w:type="spellEnd"/>
+            <w:r>
+              <w:rPr>
+                <w:rFonts w:ascii="Helvetica Neue W23 for SKY Bd" w:eastAsia="Times New Roman" w:hAnsi="Helvetica Neue W23 for SKY Bd" w:cs="Helvetica Neue W23 for SKY Bd"/>
+                <w:b/>
+                <w:bCs/>
+                <w:sz w:val="18"/>
+                <w:szCs w:val="18"/>
+                <w:rtl/>
+                <w:lang w:eastAsia="ar-SA"/>
+              </w:rPr>
+              <w:t xml:space="preserve"> منه من خلال عناصر التقويم </w:t>
+            </w:r>
+            <w:proofErr w:type="spellStart"/>
+            <w:r>
+              <w:rPr>
+                <w:rFonts w:ascii="Helvetica Neue W23 for SKY Bd" w:eastAsia="Times New Roman" w:hAnsi="Helvetica Neue W23 for SKY Bd" w:cs="Helvetica Neue W23 for SKY Bd"/>
+                <w:b/>
+                <w:bCs/>
+                <w:sz w:val="18"/>
+                <w:szCs w:val="18"/>
+                <w:rtl/>
+                <w:lang w:eastAsia="ar-SA"/>
+              </w:rPr>
+              <w:t>للاداء</w:t>
+            </w:r>
+            <w:proofErr w:type="spellEnd"/>
+            <w:r>
+              <w:rPr>
+                <w:rFonts w:ascii="Helvetica Neue W23 for SKY Bd" w:eastAsia="Times New Roman" w:hAnsi="Helvetica Neue W23 for SKY Bd" w:cs="Helvetica Neue W23 for SKY Bd"/>
+                <w:b/>
+                <w:bCs/>
+                <w:sz w:val="18"/>
+                <w:szCs w:val="18"/>
+                <w:rtl/>
+                <w:lang w:eastAsia="ar-SA"/>
+              </w:rPr>
+              <w:t>.</w:t>
             </w:r>
           </w:p>
           <w:p>
@@ -21989,6 +22601,7 @@
           <w:rtl/>
           <w:lang w:eastAsia="ar-SA"/>
         </w:rPr>
+        <w:lastRenderedPageBreak/>
         <w:t xml:space="preserve"> </w:t>
       </w:r>
     </w:p>
@@ -22010,6 +22623,34 @@
     </w:p>
     <w:p>
       <w:pPr>
+        <w:bidi w:val="0"/>
+        <w:rPr>
+          <w:rFonts w:ascii="Helvetica Neue W23 for SKY Bd" w:eastAsia="Times New Roman" w:hAnsi="Helvetica Neue W23 for SKY Bd" w:cs="Helvetica Neue W23 for SKY Bd"/>
+          <w:b/>
+          <w:bCs/>
+          <w:color w:val="FF0000"/>
+          <w:sz w:val="32"/>
+          <w:szCs w:val="40"/>
+          <w:u w:val="single"/>
+          <w:rtl/>
+        </w:rPr>
+      </w:pPr>
+      <w:r>
+        <w:rPr>
+          <w:rFonts w:ascii="Helvetica Neue W23 for SKY Bd" w:eastAsia="Times New Roman" w:hAnsi="Helvetica Neue W23 for SKY Bd" w:cs="Helvetica Neue W23 for SKY Bd"/>
+          <w:b/>
+          <w:bCs/>
+          <w:color w:val="FF0000"/>
+          <w:sz w:val="32"/>
+          <w:szCs w:val="40"/>
+          <w:u w:val="single"/>
+          <w:rtl/>
+        </w:rPr>
+        <w:br w:type="page"/>
+      </w:r>
+    </w:p>
+    <w:p>
+      <w:pPr>
         <w:spacing w:after="0" w:line="240" w:lineRule="auto"/>
         <w:jc w:val="center"/>
         <w:rPr>
@@ -22034,6 +22675,7 @@
           <w:u w:val="single"/>
           <w:rtl/>
         </w:rPr>
+        <w:lastRenderedPageBreak/>
         <w:t xml:space="preserve">اجتماع قسم التربية البدنية </w:t>
       </w:r>
     </w:p>
@@ -24733,7 +25375,33 @@
                 <w:rtl/>
                 <w:lang w:eastAsia="ar-SA"/>
               </w:rPr>
-              <w:t>يقوم معلمي القسم بتهيئة بشرح وتهيئة الطلاب لعملية التقويم الجديدة للمادة وكيفية اجراء الاختبارات وتقييمها حسب لا ئحة التقويم الجديدة.</w:t>
+              <w:t xml:space="preserve">يقوم معلمي القسم بتهيئة بشرح وتهيئة الطلاب لعملية التقويم الجديدة للمادة وكيفية اجراء الاختبارات وتقييمها حسب لا </w:t>
+            </w:r>
+            <w:proofErr w:type="spellStart"/>
+            <w:r>
+              <w:rPr>
+                <w:rFonts w:ascii="Helvetica Neue W23 for SKY Bd" w:eastAsia="Times New Roman" w:hAnsi="Helvetica Neue W23 for SKY Bd" w:cs="Helvetica Neue W23 for SKY Bd"/>
+                <w:b/>
+                <w:bCs/>
+                <w:sz w:val="18"/>
+                <w:szCs w:val="18"/>
+                <w:rtl/>
+                <w:lang w:eastAsia="ar-SA"/>
+              </w:rPr>
+              <w:t>ئحة</w:t>
+            </w:r>
+            <w:proofErr w:type="spellEnd"/>
+            <w:r>
+              <w:rPr>
+                <w:rFonts w:ascii="Helvetica Neue W23 for SKY Bd" w:eastAsia="Times New Roman" w:hAnsi="Helvetica Neue W23 for SKY Bd" w:cs="Helvetica Neue W23 for SKY Bd"/>
+                <w:b/>
+                <w:bCs/>
+                <w:sz w:val="18"/>
+                <w:szCs w:val="18"/>
+                <w:rtl/>
+                <w:lang w:eastAsia="ar-SA"/>
+              </w:rPr>
+              <w:t xml:space="preserve"> التقويم الجديدة.</w:t>
             </w:r>
           </w:p>
           <w:p>
@@ -24793,7 +25461,60 @@
                 <w:rtl/>
                 <w:lang w:eastAsia="ar-SA"/>
               </w:rPr>
-              <w:t>يقوم كل معلم بإعداد وتجهيز ملف خاص فيه ويقوم بتنظيمه وتسليمه لوكيل الشؤون التعليمية ويشمل كل عناصر الأداء الوظيفي الجديد ويحتوي على كل تقارير استراتيجيات التعلم التي يقوم بها داخل الفصل، وانشطة التدريس والخطة التعليمية الأسبوعية للتعلم، ووضع نماذج الاختبارات التشخيصية والتدريبية التي يقيمها للطلاب مع نماذج تحليلها ونماذج من الخطط العلاجية والاثرائية التي يؤديها للطلاب وأيضا على كل المهام والواجبات التي مطلوبه منه من خلال عناصر التقويم للاداء.</w:t>
+              <w:lastRenderedPageBreak/>
+              <w:t xml:space="preserve">يقوم كل معلم بإعداد وتجهيز ملف خاص فيه ويقوم بتنظيمه وتسليمه لوكيل الشؤون التعليمية ويشمل كل عناصر الأداء الوظيفي الجديد ويحتوي على كل تقارير استراتيجيات التعلم التي يقوم بها داخل الفصل، وانشطة التدريس والخطة التعليمية الأسبوعية للتعلم، ووضع نماذج الاختبارات التشخيصية والتدريبية التي يقيمها للطلاب مع نماذج تحليلها ونماذج من الخطط العلاجية والاثرائية التي يؤديها للطلاب وأيضا على كل المهام والواجبات التي </w:t>
+            </w:r>
+            <w:proofErr w:type="spellStart"/>
+            <w:r>
+              <w:rPr>
+                <w:rFonts w:ascii="Helvetica Neue W23 for SKY Bd" w:eastAsia="Times New Roman" w:hAnsi="Helvetica Neue W23 for SKY Bd" w:cs="Helvetica Neue W23 for SKY Bd"/>
+                <w:b/>
+                <w:bCs/>
+                <w:sz w:val="18"/>
+                <w:szCs w:val="18"/>
+                <w:rtl/>
+                <w:lang w:eastAsia="ar-SA"/>
+              </w:rPr>
+              <w:t>مطلوبه</w:t>
+            </w:r>
+            <w:proofErr w:type="spellEnd"/>
+            <w:r>
+              <w:rPr>
+                <w:rFonts w:ascii="Helvetica Neue W23 for SKY Bd" w:eastAsia="Times New Roman" w:hAnsi="Helvetica Neue W23 for SKY Bd" w:cs="Helvetica Neue W23 for SKY Bd"/>
+                <w:b/>
+                <w:bCs/>
+                <w:sz w:val="18"/>
+                <w:szCs w:val="18"/>
+                <w:rtl/>
+                <w:lang w:eastAsia="ar-SA"/>
+              </w:rPr>
+              <w:t xml:space="preserve"> منه من خلال عناصر التقويم </w:t>
+            </w:r>
+            <w:proofErr w:type="spellStart"/>
+            <w:r>
+              <w:rPr>
+                <w:rFonts w:ascii="Helvetica Neue W23 for SKY Bd" w:eastAsia="Times New Roman" w:hAnsi="Helvetica Neue W23 for SKY Bd" w:cs="Helvetica Neue W23 for SKY Bd"/>
+                <w:b/>
+                <w:bCs/>
+                <w:sz w:val="18"/>
+                <w:szCs w:val="18"/>
+                <w:rtl/>
+                <w:lang w:eastAsia="ar-SA"/>
+              </w:rPr>
+              <w:t>للاداء</w:t>
+            </w:r>
+            <w:proofErr w:type="spellEnd"/>
+            <w:r>
+              <w:rPr>
+                <w:rFonts w:ascii="Helvetica Neue W23 for SKY Bd" w:eastAsia="Times New Roman" w:hAnsi="Helvetica Neue W23 for SKY Bd" w:cs="Helvetica Neue W23 for SKY Bd"/>
+                <w:b/>
+                <w:bCs/>
+                <w:sz w:val="18"/>
+                <w:szCs w:val="18"/>
+                <w:rtl/>
+                <w:lang w:eastAsia="ar-SA"/>
+              </w:rPr>
+              <w:t>.</w:t>
             </w:r>
           </w:p>
           <w:p>
@@ -24902,6 +25623,7 @@
           <w:rtl/>
           <w:lang w:eastAsia="ar-SA"/>
         </w:rPr>
+        <w:lastRenderedPageBreak/>
         <w:t xml:space="preserve"> </w:t>
       </w:r>
     </w:p>
@@ -25054,6 +25776,7 @@
                             </w:rPr>
                             <w:t>مدير المدرسة: {{</w:t>
                           </w:r>
+                          <w:proofErr w:type="spellStart"/>
                           <w:r>
                             <w:rPr>
                               <w:rFonts w:ascii="Helvetica Neue W23 for SKY Reg" w:hAnsi="Helvetica Neue W23 for SKY Reg" w:cs="Times New Roman"/>
@@ -25061,6 +25784,7 @@
                             </w:rPr>
                             <w:t>principalName</w:t>
                           </w:r>
+                          <w:proofErr w:type="spellEnd"/>
                           <w:r>
                             <w:rPr>
                               <w:rFonts w:ascii="Helvetica Neue W23 for SKY Reg" w:hAnsi="Helvetica Neue W23 for SKY Reg" w:cs="Times New Roman"/>
@@ -25111,6 +25835,7 @@
                       </w:rPr>
                       <w:t>مدير المدرسة: {{</w:t>
                     </w:r>
+                    <w:proofErr w:type="spellStart"/>
                     <w:r>
                       <w:rPr>
                         <w:rFonts w:ascii="Helvetica Neue W23 for SKY Reg" w:hAnsi="Helvetica Neue W23 for SKY Reg" w:cs="Times New Roman"/>
@@ -25118,6 +25843,7 @@
                       </w:rPr>
                       <w:t>principalName</w:t>
                     </w:r>
+                    <w:proofErr w:type="spellEnd"/>
                     <w:r>
                       <w:rPr>
                         <w:rFonts w:ascii="Helvetica Neue W23 for SKY Reg" w:hAnsi="Helvetica Neue W23 for SKY Reg" w:cs="Times New Roman"/>
@@ -25534,6 +26260,7 @@
                             </w:rPr>
                             <w:t>{{</w:t>
                           </w:r>
+                          <w:proofErr w:type="spellStart"/>
                           <w:r>
                             <w:rPr>
                               <w:rFonts w:ascii="IBM Plex Sans Arabic SemiBold" w:hAnsi="IBM Plex Sans Arabic SemiBold" w:cs="IBM Plex Sans Arabic SemiBold"/>
@@ -25545,6 +26272,7 @@
                             </w:rPr>
                             <w:t>educationDepartmentPrefix</w:t>
                           </w:r>
+                          <w:proofErr w:type="spellEnd"/>
                           <w:r>
                             <w:rPr>
                               <w:rFonts w:ascii="IBM Plex Sans Arabic SemiBold" w:hAnsi="IBM Plex Sans Arabic SemiBold" w:cs="IBM Plex Sans Arabic SemiBold"/>
@@ -25582,6 +26310,7 @@
                             </w:rPr>
                             <w:t>{{</w:t>
                           </w:r>
+                          <w:proofErr w:type="spellStart"/>
                           <w:r>
                             <w:rPr>
                               <w:rFonts w:ascii="IBM Plex Sans Arabic SemiBold" w:hAnsi="IBM Plex Sans Arabic SemiBold" w:cs="IBM Plex Sans Arabic SemiBold"/>
@@ -25593,6 +26322,7 @@
                             </w:rPr>
                             <w:t>educationDepartmentName</w:t>
                           </w:r>
+                          <w:proofErr w:type="spellEnd"/>
                           <w:r>
                             <w:rPr>
                               <w:rFonts w:ascii="IBM Plex Sans Arabic SemiBold" w:hAnsi="IBM Plex Sans Arabic SemiBold" w:cs="IBM Plex Sans Arabic SemiBold"/>
@@ -25669,6 +26399,7 @@
                       </w:rPr>
                       <w:t>{{</w:t>
                     </w:r>
+                    <w:proofErr w:type="spellStart"/>
                     <w:r>
                       <w:rPr>
                         <w:rFonts w:ascii="IBM Plex Sans Arabic SemiBold" w:hAnsi="IBM Plex Sans Arabic SemiBold" w:cs="IBM Plex Sans Arabic SemiBold"/>
@@ -25680,6 +26411,7 @@
                       </w:rPr>
                       <w:t>educationDepartmentPrefix</w:t>
                     </w:r>
+                    <w:proofErr w:type="spellEnd"/>
                     <w:r>
                       <w:rPr>
                         <w:rFonts w:ascii="IBM Plex Sans Arabic SemiBold" w:hAnsi="IBM Plex Sans Arabic SemiBold" w:cs="IBM Plex Sans Arabic SemiBold"/>
@@ -25717,6 +26449,7 @@
                       </w:rPr>
                       <w:t>{{</w:t>
                     </w:r>
+                    <w:proofErr w:type="spellStart"/>
                     <w:r>
                       <w:rPr>
                         <w:rFonts w:ascii="IBM Plex Sans Arabic SemiBold" w:hAnsi="IBM Plex Sans Arabic SemiBold" w:cs="IBM Plex Sans Arabic SemiBold"/>
@@ -25728,6 +26461,7 @@
                       </w:rPr>
                       <w:t>educationDepartmentName</w:t>
                     </w:r>
+                    <w:proofErr w:type="spellEnd"/>
                     <w:r>
                       <w:rPr>
                         <w:rFonts w:ascii="IBM Plex Sans Arabic SemiBold" w:hAnsi="IBM Plex Sans Arabic SemiBold" w:cs="IBM Plex Sans Arabic SemiBold"/>
@@ -25890,7 +26624,6 @@
                               <w:color w:val="FFFFFF" w:themeColor="background1"/>
                               <w:sz w:val="32"/>
                               <w:szCs w:val="40"/>
-                              <w:u w:val="single"/>
                               <w:rtl/>
                             </w:rPr>
                           </w:pPr>
@@ -25902,11 +26635,11 @@
                               <w:color w:val="FFFFFF" w:themeColor="background1"/>
                               <w:sz w:val="32"/>
                               <w:szCs w:val="32"/>
-                              <w:u w:val="single"/>
                               <w:rtl/>
                             </w:rPr>
                             <w:t>{{</w:t>
                           </w:r>
+                          <w:proofErr w:type="spellStart"/>
                           <w:r>
                             <w:rPr>
                               <w:rFonts w:ascii="Helvetica Neue W23 for SKY Bd" w:eastAsia="Times New Roman" w:hAnsi="Helvetica Neue W23 for SKY Bd" w:cs="Helvetica Neue W23 for SKY Bd"/>
@@ -25915,10 +26648,10 @@
                               <w:color w:val="FFFFFF" w:themeColor="background1"/>
                               <w:sz w:val="32"/>
                               <w:szCs w:val="32"/>
-                              <w:u w:val="single"/>
                             </w:rPr>
                             <w:t>schoolDisplayName</w:t>
                           </w:r>
+                          <w:proofErr w:type="spellEnd"/>
                           <w:r>
                             <w:rPr>
                               <w:rFonts w:ascii="Helvetica Neue W23 for SKY Bd" w:eastAsia="Times New Roman" w:hAnsi="Helvetica Neue W23 for SKY Bd" w:cs="Helvetica Neue W23 for SKY Bd"/>
@@ -25927,7 +26660,6 @@
                               <w:color w:val="FFFFFF" w:themeColor="background1"/>
                               <w:sz w:val="32"/>
                               <w:szCs w:val="32"/>
-                              <w:u w:val="single"/>
                               <w:rtl/>
                             </w:rPr>
                             <w:t>}}</w:t>
@@ -25978,7 +26710,6 @@
                         <w:color w:val="FFFFFF" w:themeColor="background1"/>
                         <w:sz w:val="32"/>
                         <w:szCs w:val="40"/>
-                        <w:u w:val="single"/>
                         <w:rtl/>
                       </w:rPr>
                     </w:pPr>
@@ -25990,11 +26721,11 @@
                         <w:color w:val="FFFFFF" w:themeColor="background1"/>
                         <w:sz w:val="32"/>
                         <w:szCs w:val="32"/>
-                        <w:u w:val="single"/>
                         <w:rtl/>
                       </w:rPr>
                       <w:t>{{</w:t>
                     </w:r>
+                    <w:proofErr w:type="spellStart"/>
                     <w:r>
                       <w:rPr>
                         <w:rFonts w:ascii="Helvetica Neue W23 for SKY Bd" w:eastAsia="Times New Roman" w:hAnsi="Helvetica Neue W23 for SKY Bd" w:cs="Helvetica Neue W23 for SKY Bd"/>
@@ -26003,10 +26734,10 @@
                         <w:color w:val="FFFFFF" w:themeColor="background1"/>
                         <w:sz w:val="32"/>
                         <w:szCs w:val="32"/>
-                        <w:u w:val="single"/>
                       </w:rPr>
                       <w:t>schoolDisplayName</w:t>
                     </w:r>
+                    <w:proofErr w:type="spellEnd"/>
                     <w:r>
                       <w:rPr>
                         <w:rFonts w:ascii="Helvetica Neue W23 for SKY Bd" w:eastAsia="Times New Roman" w:hAnsi="Helvetica Neue W23 for SKY Bd" w:cs="Helvetica Neue W23 for SKY Bd"/>
@@ -26015,7 +26746,6 @@
                         <w:color w:val="FFFFFF" w:themeColor="background1"/>
                         <w:sz w:val="32"/>
                         <w:szCs w:val="32"/>
-                        <w:u w:val="single"/>
                         <w:rtl/>
                       </w:rPr>
                       <w:t>}}</w:t>

</xml_diff>